<commit_message>
feat: 增加读取部件参数蓝牙RSSI并优化CPU3菜单（CPU2 V1.15.0.0 / CPU3 V1.14.0.0）
版本：
- CPU2：V1.14.0.1 -> V1.15.0.0。
- CPU3：V1.13.0.0 -> V1.14.0.0。

协议版本/兼容性：
- 该历史提交未单列协议或兼容性说明；本次说明改写不改变该提交的文件树和程序行为。

本次修改：
- feat: 增加读取部件参数蓝牙RSSI并优化CPU3菜单

验证：
- py tools\check_wireless_rssi_contract.py
- py tools\check_si7000_protocol_contract.py
- py tools\check_density_level_control_contract.py
- py tools\check_read_part_params_refresh_contract.py
- py LTD_DISPLAY_CPU3\font_check.py
- py tools\update_flow_navigation.py
- cmake -S LTD_MAIN_CPU2 -B build\LTD_MAIN_CPU2 -G Ninja -DCMAKE_TOOLCHAIN_FILE=D:/CUBE/cmake/toolchain-arm-none-eabi.cmake
- cmake -S LTD_DISPLAY_CPU3 -B build\LTD_DISPLAY_CPU3 -G Ninja -DCMAKE_TOOLCHAIN_FILE=D:/CUBE/cmake/toolchain-arm-none-eabi.cmake
- cmake --build build\LTD_MAIN_CPU2
- cmake --build build\LTD_DISPLAY_CPU3
- git diff --cached --check
- py tools\check_version_bumped.py
</commit_message>
<xml_diff>
--- a/docs/04_界面与菜单/LNG计量仪屏幕菜单.docx
+++ b/docs/04_界面与菜单/LNG计量仪屏幕菜单.docx
@@ -23,7 +23,7 @@
         <w:jc w:val="center"/>
       </w:pPr>
       <w:r>
-        <w:t>按当前 CPU2 V1.12.1.3 / CPU3 V1.11.1.4 程序更新版</w:t>
+        <w:t>按当前 CPU2 V1.15.0.0 / CPU3 V1.14.0.0 程序更新版</w:t>
       </w:r>
     </w:p>
     <w:p>
@@ -37,7 +37,7 @@
           <w:color w:val="5A5A5A"/>
           <w:sz w:val="17"/>
         </w:rPr>
-        <w:t>更新日期：2026-06-10。本文依据当前 CPU3 菜单实现、param_meta[] 参数元数据、CPU2 参数默认值、CPU3 本机参数默认值和串口协议联动逻辑整理，用于对外说明菜单结构、参数含义、权限范围、单位、出厂默认值和现场设置值。</w:t>
+        <w:t>更新日期：2026-06-13。本文依据当前 CPU3 菜单实现、param_meta[] 参数元数据、CPU2 参数默认值、CPU3 本机参数默认值和串口协议联动逻辑整理，用于对外说明菜单结构、参数含义、权限范围、单位、出厂默认值、现场设置值和菜单返回关系。</w:t>
       </w:r>
     </w:p>
     <w:p>
@@ -1602,17 +1602,7 @@
             </w:tcMar>
           </w:tcPr>
           <w:p>
-            <w:pPr>
-              <w:spacing w:after="0" w:line="240" w:lineRule="auto" w:before="0"/>
-              <w:jc w:val="center"/>
-            </w:pPr>
-            <w:r>
-              <w:rPr>
-                <w:rFonts w:ascii="Arial" w:hAnsi="Arial" w:eastAsia="Microsoft YaHei"/>
-                <w:b/>
-                <w:color w:val="232323"/>
-                <w:sz w:val="17"/>
-              </w:rPr>
+            <w:r>
               <w:t>一级菜单</w:t>
             </w:r>
           </w:p>
@@ -1630,17 +1620,7 @@
             </w:tcMar>
           </w:tcPr>
           <w:p>
-            <w:pPr>
-              <w:spacing w:after="0" w:line="240" w:lineRule="auto" w:before="0"/>
-              <w:jc w:val="center"/>
-            </w:pPr>
-            <w:r>
-              <w:rPr>
-                <w:rFonts w:ascii="Arial" w:hAnsi="Arial" w:eastAsia="Microsoft YaHei"/>
-                <w:b/>
-                <w:color w:val="232323"/>
-                <w:sz w:val="17"/>
-              </w:rPr>
+            <w:r>
               <w:t>下级内容</w:t>
             </w:r>
           </w:p>
@@ -1658,17 +1638,7 @@
             </w:tcMar>
           </w:tcPr>
           <w:p>
-            <w:pPr>
-              <w:spacing w:after="0" w:line="240" w:lineRule="auto" w:before="0"/>
-              <w:jc w:val="center"/>
-            </w:pPr>
-            <w:r>
-              <w:rPr>
-                <w:rFonts w:ascii="Arial" w:hAnsi="Arial" w:eastAsia="Microsoft YaHei"/>
-                <w:b/>
-                <w:color w:val="232323"/>
-                <w:sz w:val="17"/>
-              </w:rPr>
+            <w:r>
               <w:t>说明</w:t>
             </w:r>
           </w:p>
@@ -1706,17 +1676,7 @@
             </w:tcMar>
           </w:tcPr>
           <w:p>
-            <w:pPr>
-              <w:spacing w:after="0" w:line="240" w:lineRule="auto" w:before="0"/>
-              <w:jc w:val="left"/>
-            </w:pPr>
-            <w:r>
-              <w:rPr>
-                <w:rFonts w:ascii="Arial" w:hAnsi="Arial" w:eastAsia="Microsoft YaHei"/>
-                <w:b w:val="0"/>
-                <w:color w:val="232323"/>
-                <w:sz w:val="17"/>
-              </w:rPr>
+            <w:r>
               <w:t>测量命令</w:t>
             </w:r>
           </w:p>
@@ -1733,18 +1693,8 @@
             </w:tcMar>
           </w:tcPr>
           <w:p>
-            <w:pPr>
-              <w:spacing w:after="0" w:line="240" w:lineRule="auto" w:before="0"/>
-              <w:jc w:val="left"/>
-            </w:pPr>
-            <w:r>
-              <w:rPr>
-                <w:rFonts w:ascii="Arial" w:hAnsi="Arial" w:eastAsia="Microsoft YaHei"/>
-                <w:b w:val="0"/>
-                <w:color w:val="232323"/>
-                <w:sz w:val="17"/>
-              </w:rPr>
-              <w:t>16 个测量命令</w:t>
+            <w:r>
+              <w:t>提零点、液位测量、水位测量、罐高测量、综合测量、读取部件参数、密度单点测量、密度分布测量、浮子运行到高度</w:t>
             </w:r>
           </w:p>
         </w:tc>
@@ -1760,18 +1710,8 @@
             </w:tcMar>
           </w:tcPr>
           <w:p>
-            <w:pPr>
-              <w:spacing w:after="0" w:line="240" w:lineRule="auto" w:before="0"/>
-              <w:jc w:val="left"/>
-            </w:pPr>
-            <w:r>
-              <w:rPr>
-                <w:rFonts w:ascii="Arial" w:hAnsi="Arial" w:eastAsia="Microsoft YaHei"/>
-                <w:b w:val="0"/>
-                <w:color w:val="232323"/>
-                <w:sz w:val="17"/>
-              </w:rPr>
-              <w:t>液位、水位、罐高、密度、区间密度和读取部件参数等测量流程。</w:t>
+            <w:r>
+              <w:t>普通测量入口；水位和密度相关命令按子菜单聚合，读取部件参数位于第 6 位。</w:t>
             </w:r>
           </w:p>
         </w:tc>
@@ -1808,17 +1748,7 @@
             </w:tcMar>
           </w:tcPr>
           <w:p>
-            <w:pPr>
-              <w:spacing w:after="0" w:line="240" w:lineRule="auto" w:before="0"/>
-              <w:jc w:val="left"/>
-            </w:pPr>
-            <w:r>
-              <w:rPr>
-                <w:rFonts w:ascii="Arial" w:hAnsi="Arial" w:eastAsia="Microsoft YaHei"/>
-                <w:b w:val="0"/>
-                <w:color w:val="232323"/>
-                <w:sz w:val="17"/>
-              </w:rPr>
+            <w:r>
               <w:t>参数配置</w:t>
             </w:r>
           </w:p>
@@ -1835,18 +1765,8 @@
             </w:tcMar>
           </w:tcPr>
           <w:p>
-            <w:pPr>
-              <w:spacing w:after="0" w:line="240" w:lineRule="auto" w:before="0"/>
-              <w:jc w:val="left"/>
-            </w:pPr>
-            <w:r>
-              <w:rPr>
-                <w:rFonts w:ascii="Arial" w:hAnsi="Arial" w:eastAsia="Microsoft YaHei"/>
-                <w:b w:val="0"/>
-                <w:color w:val="232323"/>
-                <w:sz w:val="17"/>
-              </w:rPr>
-              <w:t>5 个一级入口，174 个现场可见参数</w:t>
+            <w:r>
+              <w:t>5 个一级入口，现场可见参数按分组展开</w:t>
             </w:r>
           </w:p>
         </w:tc>
@@ -1862,17 +1782,7 @@
             </w:tcMar>
           </w:tcPr>
           <w:p>
-            <w:pPr>
-              <w:spacing w:after="0" w:line="240" w:lineRule="auto" w:before="0"/>
-              <w:jc w:val="left"/>
-            </w:pPr>
-            <w:r>
-              <w:rPr>
-                <w:rFonts w:ascii="Arial" w:hAnsi="Arial" w:eastAsia="Microsoft YaHei"/>
-                <w:b w:val="0"/>
-                <w:color w:val="232323"/>
-                <w:sz w:val="17"/>
-              </w:rPr>
+            <w:r>
               <w:t>测量参数、输出配置、通信设置、显示设置、维护设置；标定和调试位置参数随指令输入。</w:t>
             </w:r>
           </w:p>
@@ -1910,17 +1820,7 @@
             </w:tcMar>
           </w:tcPr>
           <w:p>
-            <w:pPr>
-              <w:spacing w:after="0" w:line="240" w:lineRule="auto" w:before="0"/>
-              <w:jc w:val="left"/>
-            </w:pPr>
-            <w:r>
-              <w:rPr>
-                <w:rFonts w:ascii="Arial" w:hAnsi="Arial" w:eastAsia="Microsoft YaHei"/>
-                <w:b w:val="0"/>
-                <w:color w:val="232323"/>
-                <w:sz w:val="17"/>
-              </w:rPr>
+            <w:r>
               <w:t>调试指令</w:t>
             </w:r>
           </w:p>
@@ -1937,18 +1837,8 @@
             </w:tcMar>
           </w:tcPr>
           <w:p>
-            <w:pPr>
-              <w:spacing w:after="0" w:line="240" w:lineRule="auto" w:before="0"/>
-              <w:jc w:val="left"/>
-            </w:pPr>
-            <w:r>
-              <w:rPr>
-                <w:rFonts w:ascii="Arial" w:hAnsi="Arial" w:eastAsia="Microsoft YaHei"/>
-                <w:b w:val="0"/>
-                <w:color w:val="232323"/>
-                <w:sz w:val="17"/>
-              </w:rPr>
-              <w:t>15 个调试/标定命令</w:t>
+            <w:r>
+              <w:t>浮子运动控制、标定修正、称重标定、无线维护、系统维护</w:t>
             </w:r>
           </w:p>
         </w:tc>
@@ -1964,18 +1854,8 @@
             </w:tcMar>
           </w:tcPr>
           <w:p>
-            <w:pPr>
-              <w:spacing w:after="0" w:line="240" w:lineRule="auto" w:before="0"/>
-              <w:jc w:val="left"/>
-            </w:pPr>
-            <w:r>
-              <w:rPr>
-                <w:rFonts w:ascii="Arial" w:hAnsi="Arial" w:eastAsia="Microsoft YaHei"/>
-                <w:b w:val="0"/>
-                <w:color w:val="232323"/>
-                <w:sz w:val="17"/>
-              </w:rPr>
-              <w:t>上/下行、强制控制、零点/液位/水位/罐高标定、称重采集和维护模式。</w:t>
+            <w:r>
+              <w:t>15 个调试/标定命令按用途分组；上/下行仍在调试指令密码边界内。</w:t>
             </w:r>
           </w:p>
         </w:tc>
@@ -2012,17 +1892,7 @@
             </w:tcMar>
           </w:tcPr>
           <w:p>
-            <w:pPr>
-              <w:spacing w:after="0" w:line="240" w:lineRule="auto" w:before="0"/>
-              <w:jc w:val="left"/>
-            </w:pPr>
-            <w:r>
-              <w:rPr>
-                <w:rFonts w:ascii="Arial" w:hAnsi="Arial" w:eastAsia="Microsoft YaHei"/>
-                <w:b w:val="0"/>
-                <w:color w:val="232323"/>
-                <w:sz w:val="17"/>
-              </w:rPr>
+            <w:r>
               <w:t>语言</w:t>
             </w:r>
           </w:p>
@@ -2039,17 +1909,7 @@
             </w:tcMar>
           </w:tcPr>
           <w:p>
-            <w:pPr>
-              <w:spacing w:after="0" w:line="240" w:lineRule="auto" w:before="0"/>
-              <w:jc w:val="left"/>
-            </w:pPr>
-            <w:r>
-              <w:rPr>
-                <w:rFonts w:ascii="Arial" w:hAnsi="Arial" w:eastAsia="Microsoft YaHei"/>
-                <w:b w:val="0"/>
-                <w:color w:val="232323"/>
-                <w:sz w:val="17"/>
-              </w:rPr>
+            <w:r>
               <w:t>中文、英文、退出</w:t>
             </w:r>
           </w:p>
@@ -2066,17 +1926,7 @@
             </w:tcMar>
           </w:tcPr>
           <w:p>
-            <w:pPr>
-              <w:spacing w:after="0" w:line="240" w:lineRule="auto" w:before="0"/>
-              <w:jc w:val="left"/>
-            </w:pPr>
-            <w:r>
-              <w:rPr>
-                <w:rFonts w:ascii="Arial" w:hAnsi="Arial" w:eastAsia="Microsoft YaHei"/>
-                <w:b w:val="0"/>
-                <w:color w:val="232323"/>
-                <w:sz w:val="17"/>
-              </w:rPr>
+            <w:r>
               <w:t>切换屏幕显示语言。</w:t>
             </w:r>
           </w:p>
@@ -2114,17 +1964,7 @@
             </w:tcMar>
           </w:tcPr>
           <w:p>
-            <w:pPr>
-              <w:spacing w:after="0" w:line="240" w:lineRule="auto" w:before="0"/>
-              <w:jc w:val="left"/>
-            </w:pPr>
-            <w:r>
-              <w:rPr>
-                <w:rFonts w:ascii="Arial" w:hAnsi="Arial" w:eastAsia="Microsoft YaHei"/>
-                <w:b w:val="0"/>
-                <w:color w:val="232323"/>
-                <w:sz w:val="17"/>
-              </w:rPr>
+            <w:r>
               <w:t>退出</w:t>
             </w:r>
           </w:p>
@@ -2141,17 +1981,7 @@
             </w:tcMar>
           </w:tcPr>
           <w:p>
-            <w:pPr>
-              <w:spacing w:after="0" w:line="240" w:lineRule="auto" w:before="0"/>
-              <w:jc w:val="left"/>
-            </w:pPr>
-            <w:r>
-              <w:rPr>
-                <w:rFonts w:ascii="Arial" w:hAnsi="Arial" w:eastAsia="Microsoft YaHei"/>
-                <w:b w:val="0"/>
-                <w:color w:val="232323"/>
-                <w:sz w:val="17"/>
-              </w:rPr>
+            <w:r>
               <w:t>无下级菜单</w:t>
             </w:r>
           </w:p>
@@ -2168,17 +1998,7 @@
             </w:tcMar>
           </w:tcPr>
           <w:p>
-            <w:pPr>
-              <w:spacing w:after="0" w:line="240" w:lineRule="auto" w:before="0"/>
-              <w:jc w:val="left"/>
-            </w:pPr>
-            <w:r>
-              <w:rPr>
-                <w:rFonts w:ascii="Arial" w:hAnsi="Arial" w:eastAsia="Microsoft YaHei"/>
-                <w:b w:val="0"/>
-                <w:color w:val="232323"/>
-                <w:sz w:val="17"/>
-              </w:rPr>
+            <w:r>
               <w:t>退出屏幕菜单。</w:t>
             </w:r>
           </w:p>
@@ -2200,7 +2020,7 @@
           <w:color w:val="232323"/>
           <w:sz w:val="18"/>
         </w:rPr>
-        <w:t>参数配置首页当前为：测量参数、输出配置、通信设置、显示设置、维护设置。屏幕每页最多显示 4 行，带“返回”项的页面用于回到上一级。</w:t>
+        <w:t>参数配置首页当前为：测量参数、输出配置、通信设置、显示设置、维护设置。测量命令已按水位测量、密度单点测量、密度分布测量聚合；调试指令已按浮子运动控制、标定修正、称重标定、无线维护、系统维护分组。屏幕每页最多显示 4 行，带“返回”项的页面用于回到上一级。</w:t>
       </w:r>
     </w:p>
     <w:p>
@@ -2278,17 +2098,7 @@
             </w:tcMar>
           </w:tcPr>
           <w:p>
-            <w:pPr>
-              <w:spacing w:after="0" w:line="240" w:lineRule="auto" w:before="0"/>
-              <w:jc w:val="center"/>
-            </w:pPr>
-            <w:r>
-              <w:rPr>
-                <w:rFonts w:ascii="Arial" w:hAnsi="Arial" w:eastAsia="Microsoft YaHei"/>
-                <w:b/>
-                <w:color w:val="232323"/>
-                <w:sz w:val="17"/>
-              </w:rPr>
+            <w:r>
               <w:t>菜单项</w:t>
             </w:r>
           </w:p>
@@ -2306,17 +2116,7 @@
             </w:tcMar>
           </w:tcPr>
           <w:p>
-            <w:pPr>
-              <w:spacing w:after="0" w:line="240" w:lineRule="auto" w:before="0"/>
-              <w:jc w:val="center"/>
-            </w:pPr>
-            <w:r>
-              <w:rPr>
-                <w:rFonts w:ascii="Arial" w:hAnsi="Arial" w:eastAsia="Microsoft YaHei"/>
-                <w:b/>
-                <w:color w:val="232323"/>
-                <w:sz w:val="17"/>
-              </w:rPr>
+            <w:r>
               <w:t>说明/现场设置值</w:t>
             </w:r>
           </w:p>
@@ -2354,17 +2154,7 @@
             </w:tcMar>
           </w:tcPr>
           <w:p>
-            <w:pPr>
-              <w:spacing w:after="0" w:line="240" w:lineRule="auto" w:before="0"/>
-              <w:jc w:val="left"/>
-            </w:pPr>
-            <w:r>
-              <w:rPr>
-                <w:rFonts w:ascii="Arial" w:hAnsi="Arial" w:eastAsia="Microsoft YaHei"/>
-                <w:b w:val="0"/>
-                <w:color w:val="232323"/>
-                <w:sz w:val="17"/>
-              </w:rPr>
+            <w:r>
               <w:t>提零点</w:t>
             </w:r>
           </w:p>
@@ -2381,17 +2171,7 @@
             </w:tcMar>
           </w:tcPr>
           <w:p>
-            <w:pPr>
-              <w:spacing w:after="0" w:line="240" w:lineRule="auto" w:before="0"/>
-              <w:jc w:val="left"/>
-            </w:pPr>
-            <w:r>
-              <w:rPr>
-                <w:rFonts w:ascii="Arial" w:hAnsi="Arial" w:eastAsia="Microsoft YaHei"/>
-                <w:b w:val="0"/>
-                <w:color w:val="232323"/>
-                <w:sz w:val="17"/>
-              </w:rPr>
+            <w:r>
               <w:t>执行零点提升流程。</w:t>
             </w:r>
           </w:p>
@@ -2429,17 +2209,7 @@
             </w:tcMar>
           </w:tcPr>
           <w:p>
-            <w:pPr>
-              <w:spacing w:after="0" w:line="240" w:lineRule="auto" w:before="0"/>
-              <w:jc w:val="left"/>
-            </w:pPr>
-            <w:r>
-              <w:rPr>
-                <w:rFonts w:ascii="Arial" w:hAnsi="Arial" w:eastAsia="Microsoft YaHei"/>
-                <w:b w:val="0"/>
-                <w:color w:val="232323"/>
-                <w:sz w:val="17"/>
-              </w:rPr>
+            <w:r>
               <w:t>液位测量</w:t>
             </w:r>
           </w:p>
@@ -2456,17 +2226,7 @@
             </w:tcMar>
           </w:tcPr>
           <w:p>
-            <w:pPr>
-              <w:spacing w:after="0" w:line="240" w:lineRule="auto" w:before="0"/>
-              <w:jc w:val="left"/>
-            </w:pPr>
-            <w:r>
-              <w:rPr>
-                <w:rFonts w:ascii="Arial" w:hAnsi="Arial" w:eastAsia="Microsoft YaHei"/>
-                <w:b w:val="0"/>
-                <w:color w:val="232323"/>
-                <w:sz w:val="17"/>
-              </w:rPr>
+            <w:r>
               <w:t>启动液位单次测量。</w:t>
             </w:r>
           </w:p>
@@ -2504,18 +2264,8 @@
             </w:tcMar>
           </w:tcPr>
           <w:p>
-            <w:pPr>
-              <w:spacing w:after="0" w:line="240" w:lineRule="auto" w:before="0"/>
-              <w:jc w:val="left"/>
-            </w:pPr>
-            <w:r>
-              <w:rPr>
-                <w:rFonts w:ascii="Arial" w:hAnsi="Arial" w:eastAsia="Microsoft YaHei"/>
-                <w:b w:val="0"/>
-                <w:color w:val="232323"/>
-                <w:sz w:val="17"/>
-              </w:rPr>
-              <w:t>水位单次测量</w:t>
+            <w:r>
+              <w:t>水位测量</w:t>
             </w:r>
           </w:p>
         </w:tc>
@@ -2531,18 +2281,8 @@
             </w:tcMar>
           </w:tcPr>
           <w:p>
-            <w:pPr>
-              <w:spacing w:after="0" w:line="240" w:lineRule="auto" w:before="0"/>
-              <w:jc w:val="left"/>
-            </w:pPr>
-            <w:r>
-              <w:rPr>
-                <w:rFonts w:ascii="Arial" w:hAnsi="Arial" w:eastAsia="Microsoft YaHei"/>
-                <w:b w:val="0"/>
-                <w:color w:val="232323"/>
-                <w:sz w:val="17"/>
-              </w:rPr>
-              <w:t>启动水位单次测量。</w:t>
+            <w:r>
+              <w:t>水位测量子菜单入口。</w:t>
             </w:r>
           </w:p>
         </w:tc>
@@ -2579,18 +2319,8 @@
             </w:tcMar>
           </w:tcPr>
           <w:p>
-            <w:pPr>
-              <w:spacing w:after="0" w:line="240" w:lineRule="auto" w:before="0"/>
-              <w:jc w:val="left"/>
-            </w:pPr>
-            <w:r>
-              <w:rPr>
-                <w:rFonts w:ascii="Arial" w:hAnsi="Arial" w:eastAsia="Microsoft YaHei"/>
-                <w:b w:val="0"/>
-                <w:color w:val="232323"/>
-                <w:sz w:val="17"/>
-              </w:rPr>
-              <w:t>罐高测量</w:t>
+            <w:r>
+              <w:t xml:space="preserve">  1. 水位单次测量</w:t>
             </w:r>
           </w:p>
         </w:tc>
@@ -2606,18 +2336,8 @@
             </w:tcMar>
           </w:tcPr>
           <w:p>
-            <w:pPr>
-              <w:spacing w:after="0" w:line="240" w:lineRule="auto" w:before="0"/>
-              <w:jc w:val="left"/>
-            </w:pPr>
-            <w:r>
-              <w:rPr>
-                <w:rFonts w:ascii="Arial" w:hAnsi="Arial" w:eastAsia="Microsoft YaHei"/>
-                <w:b w:val="0"/>
-                <w:color w:val="232323"/>
-                <w:sz w:val="17"/>
-              </w:rPr>
-              <w:t>启动罐高测量流程。</w:t>
+            <w:r>
+              <w:t>启动水位单次测量。</w:t>
             </w:r>
           </w:p>
         </w:tc>
@@ -2654,18 +2374,8 @@
             </w:tcMar>
           </w:tcPr>
           <w:p>
-            <w:pPr>
-              <w:spacing w:after="0" w:line="240" w:lineRule="auto" w:before="0"/>
-              <w:jc w:val="left"/>
-            </w:pPr>
-            <w:r>
-              <w:rPr>
-                <w:rFonts w:ascii="Arial" w:hAnsi="Arial" w:eastAsia="Microsoft YaHei"/>
-                <w:b w:val="0"/>
-                <w:color w:val="232323"/>
-                <w:sz w:val="17"/>
-              </w:rPr>
-              <w:t>密度单点测量</w:t>
+            <w:r>
+              <w:t xml:space="preserve">  2. 水位跟随</w:t>
             </w:r>
           </w:p>
         </w:tc>
@@ -2681,18 +2391,8 @@
             </w:tcMar>
           </w:tcPr>
           <w:p>
-            <w:pPr>
-              <w:spacing w:after="0" w:line="240" w:lineRule="auto" w:before="0"/>
-              <w:jc w:val="left"/>
-            </w:pPr>
-            <w:r>
-              <w:rPr>
-                <w:rFonts w:ascii="Arial" w:hAnsi="Arial" w:eastAsia="Microsoft YaHei"/>
-                <w:b w:val="0"/>
-                <w:color w:val="232323"/>
-                <w:sz w:val="17"/>
-              </w:rPr>
-              <w:t>在指定位置执行一次密度测量。</w:t>
+            <w:r>
+              <w:t>启动水位跟随测量。</w:t>
             </w:r>
           </w:p>
         </w:tc>
@@ -2729,18 +2429,8 @@
             </w:tcMar>
           </w:tcPr>
           <w:p>
-            <w:pPr>
-              <w:spacing w:after="0" w:line="240" w:lineRule="auto" w:before="0"/>
-              <w:jc w:val="left"/>
-            </w:pPr>
-            <w:r>
-              <w:rPr>
-                <w:rFonts w:ascii="Arial" w:hAnsi="Arial" w:eastAsia="Microsoft YaHei"/>
-                <w:b w:val="0"/>
-                <w:color w:val="232323"/>
-                <w:sz w:val="17"/>
-              </w:rPr>
-              <w:t>密度单点监测</w:t>
+            <w:r>
+              <w:t>罐高测量</w:t>
             </w:r>
           </w:p>
         </w:tc>
@@ -2756,18 +2446,8 @@
             </w:tcMar>
           </w:tcPr>
           <w:p>
-            <w:pPr>
-              <w:spacing w:after="0" w:line="240" w:lineRule="auto" w:before="0"/>
-              <w:jc w:val="left"/>
-            </w:pPr>
-            <w:r>
-              <w:rPr>
-                <w:rFonts w:ascii="Arial" w:hAnsi="Arial" w:eastAsia="Microsoft YaHei"/>
-                <w:b w:val="0"/>
-                <w:color w:val="232323"/>
-                <w:sz w:val="17"/>
-              </w:rPr>
-              <w:t>对单点密度执行连续监测。</w:t>
+            <w:r>
+              <w:t>启动罐高测量流程。</w:t>
             </w:r>
           </w:p>
         </w:tc>
@@ -2804,17 +2484,7 @@
             </w:tcMar>
           </w:tcPr>
           <w:p>
-            <w:pPr>
-              <w:spacing w:after="0" w:line="240" w:lineRule="auto" w:before="0"/>
-              <w:jc w:val="left"/>
-            </w:pPr>
-            <w:r>
-              <w:rPr>
-                <w:rFonts w:ascii="Arial" w:hAnsi="Arial" w:eastAsia="Microsoft YaHei"/>
-                <w:b w:val="0"/>
-                <w:color w:val="232323"/>
-                <w:sz w:val="17"/>
-              </w:rPr>
+            <w:r>
               <w:t>综合测量</w:t>
             </w:r>
           </w:p>
@@ -2831,17 +2501,7 @@
             </w:tcMar>
           </w:tcPr>
           <w:p>
-            <w:pPr>
-              <w:spacing w:after="0" w:line="240" w:lineRule="auto" w:before="0"/>
-              <w:jc w:val="left"/>
-            </w:pPr>
-            <w:r>
-              <w:rPr>
-                <w:rFonts w:ascii="Arial" w:hAnsi="Arial" w:eastAsia="Microsoft YaHei"/>
-                <w:b w:val="0"/>
-                <w:color w:val="232323"/>
-                <w:sz w:val="17"/>
-              </w:rPr>
+            <w:r>
               <w:t>综合执行液位、水位、密度等测量任务。</w:t>
             </w:r>
           </w:p>
@@ -2879,18 +2539,8 @@
             </w:tcMar>
           </w:tcPr>
           <w:p>
-            <w:pPr>
-              <w:spacing w:after="0" w:line="240" w:lineRule="auto" w:before="0"/>
-              <w:jc w:val="left"/>
-            </w:pPr>
-            <w:r>
-              <w:rPr>
-                <w:rFonts w:ascii="Arial" w:hAnsi="Arial" w:eastAsia="Microsoft YaHei"/>
-                <w:b w:val="0"/>
-                <w:color w:val="232323"/>
-                <w:sz w:val="17"/>
-              </w:rPr>
-              <w:t>水位跟随</w:t>
+            <w:r>
+              <w:t>读取部件参数</w:t>
             </w:r>
           </w:p>
         </w:tc>
@@ -2906,18 +2556,8 @@
             </w:tcMar>
           </w:tcPr>
           <w:p>
-            <w:pPr>
-              <w:spacing w:after="0" w:line="240" w:lineRule="auto" w:before="0"/>
-              <w:jc w:val="left"/>
-            </w:pPr>
-            <w:r>
-              <w:rPr>
-                <w:rFonts w:ascii="Arial" w:hAnsi="Arial" w:eastAsia="Microsoft YaHei"/>
-                <w:b w:val="0"/>
-                <w:color w:val="232323"/>
-                <w:sz w:val="17"/>
-              </w:rPr>
-              <w:t>启动水位跟随测量。</w:t>
+            <w:r>
+              <w:t>读取部件参数和调试快照信息；位于测量命令第 6 位。</w:t>
             </w:r>
           </w:p>
         </w:tc>
@@ -2954,18 +2594,8 @@
             </w:tcMar>
           </w:tcPr>
           <w:p>
-            <w:pPr>
-              <w:spacing w:after="0" w:line="240" w:lineRule="auto" w:before="0"/>
-              <w:jc w:val="left"/>
-            </w:pPr>
-            <w:r>
-              <w:rPr>
-                <w:rFonts w:ascii="Arial" w:hAnsi="Arial" w:eastAsia="Microsoft YaHei"/>
-                <w:b w:val="0"/>
-                <w:color w:val="232323"/>
-                <w:sz w:val="17"/>
-              </w:rPr>
-              <w:t>浮子运行到高度</w:t>
+            <w:r>
+              <w:t>密度单点测量</w:t>
             </w:r>
           </w:p>
         </w:tc>
@@ -2981,18 +2611,8 @@
             </w:tcMar>
           </w:tcPr>
           <w:p>
-            <w:pPr>
-              <w:spacing w:after="0" w:line="240" w:lineRule="auto" w:before="0"/>
-              <w:jc w:val="left"/>
-            </w:pPr>
-            <w:r>
-              <w:rPr>
-                <w:rFonts w:ascii="Arial" w:hAnsi="Arial" w:eastAsia="Microsoft YaHei"/>
-                <w:b w:val="0"/>
-                <w:color w:val="232323"/>
-                <w:sz w:val="17"/>
-              </w:rPr>
-              <w:t>控制浮子运行到指定高度。</w:t>
+            <w:r>
+              <w:t>密度单点测量子菜单入口。</w:t>
             </w:r>
           </w:p>
         </w:tc>
@@ -3029,18 +2649,8 @@
             </w:tcMar>
           </w:tcPr>
           <w:p>
-            <w:pPr>
-              <w:spacing w:after="0" w:line="240" w:lineRule="auto" w:before="0"/>
-              <w:jc w:val="left"/>
-            </w:pPr>
-            <w:r>
-              <w:rPr>
-                <w:rFonts w:ascii="Arial" w:hAnsi="Arial" w:eastAsia="Microsoft YaHei"/>
-                <w:b w:val="0"/>
-                <w:color w:val="232323"/>
-                <w:sz w:val="17"/>
-              </w:rPr>
-              <w:t>分布测量</w:t>
+            <w:r>
+              <w:t xml:space="preserve">  1. 密度单点测量</w:t>
             </w:r>
           </w:p>
         </w:tc>
@@ -3056,18 +2666,8 @@
             </w:tcMar>
           </w:tcPr>
           <w:p>
-            <w:pPr>
-              <w:spacing w:after="0" w:line="240" w:lineRule="auto" w:before="0"/>
-              <w:jc w:val="left"/>
-            </w:pPr>
-            <w:r>
-              <w:rPr>
-                <w:rFonts w:ascii="Arial" w:hAnsi="Arial" w:eastAsia="Microsoft YaHei"/>
-                <w:b w:val="0"/>
-                <w:color w:val="232323"/>
-                <w:sz w:val="17"/>
-              </w:rPr>
-              <w:t>执行密度分布测量。</w:t>
+            <w:r>
+              <w:t>在指定位置执行一次密度测量。</w:t>
             </w:r>
           </w:p>
         </w:tc>
@@ -3104,18 +2704,8 @@
             </w:tcMar>
           </w:tcPr>
           <w:p>
-            <w:pPr>
-              <w:spacing w:after="0" w:line="240" w:lineRule="auto" w:before="0"/>
-              <w:jc w:val="left"/>
-            </w:pPr>
-            <w:r>
-              <w:rPr>
-                <w:rFonts w:ascii="Arial" w:hAnsi="Arial" w:eastAsia="Microsoft YaHei"/>
-                <w:b w:val="0"/>
-                <w:color w:val="232323"/>
-                <w:sz w:val="17"/>
-              </w:rPr>
-              <w:t>国标分布测量</w:t>
+            <w:r>
+              <w:t xml:space="preserve">  2. 密度单点监测</w:t>
             </w:r>
           </w:p>
         </w:tc>
@@ -3131,18 +2721,8 @@
             </w:tcMar>
           </w:tcPr>
           <w:p>
-            <w:pPr>
-              <w:spacing w:after="0" w:line="240" w:lineRule="auto" w:before="0"/>
-              <w:jc w:val="left"/>
-            </w:pPr>
-            <w:r>
-              <w:rPr>
-                <w:rFonts w:ascii="Arial" w:hAnsi="Arial" w:eastAsia="Microsoft YaHei"/>
-                <w:b w:val="0"/>
-                <w:color w:val="232323"/>
-                <w:sz w:val="17"/>
-              </w:rPr>
-              <w:t>执行国标密度分布测量。</w:t>
+            <w:r>
+              <w:t>对单点密度执行连续监测。</w:t>
             </w:r>
           </w:p>
         </w:tc>
@@ -3179,18 +2759,8 @@
             </w:tcMar>
           </w:tcPr>
           <w:p>
-            <w:pPr>
-              <w:spacing w:after="0" w:line="240" w:lineRule="auto" w:before="0"/>
-              <w:jc w:val="left"/>
-            </w:pPr>
-            <w:r>
-              <w:rPr>
-                <w:rFonts w:ascii="Arial" w:hAnsi="Arial" w:eastAsia="Microsoft YaHei"/>
-                <w:b w:val="0"/>
-                <w:color w:val="232323"/>
-                <w:sz w:val="17"/>
-              </w:rPr>
-              <w:t>密度每米测量</w:t>
+            <w:r>
+              <w:t>密度分布测量</w:t>
             </w:r>
           </w:p>
         </w:tc>
@@ -3206,18 +2776,8 @@
             </w:tcMar>
           </w:tcPr>
           <w:p>
-            <w:pPr>
-              <w:spacing w:after="0" w:line="240" w:lineRule="auto" w:before="0"/>
-              <w:jc w:val="left"/>
-            </w:pPr>
-            <w:r>
-              <w:rPr>
-                <w:rFonts w:ascii="Arial" w:hAnsi="Arial" w:eastAsia="Microsoft YaHei"/>
-                <w:b w:val="0"/>
-                <w:color w:val="232323"/>
-                <w:sz w:val="17"/>
-              </w:rPr>
-              <w:t>按每米间隔执行密度测量。</w:t>
+            <w:r>
+              <w:t>密度分布测量子菜单入口。</w:t>
             </w:r>
           </w:p>
         </w:tc>
@@ -3254,18 +2814,8 @@
             </w:tcMar>
           </w:tcPr>
           <w:p>
-            <w:pPr>
-              <w:spacing w:after="0" w:line="240" w:lineRule="auto" w:before="0"/>
-              <w:jc w:val="left"/>
-            </w:pPr>
-            <w:r>
-              <w:rPr>
-                <w:rFonts w:ascii="Arial" w:hAnsi="Arial" w:eastAsia="Microsoft YaHei"/>
-                <w:b w:val="0"/>
-                <w:color w:val="232323"/>
-                <w:sz w:val="17"/>
-              </w:rPr>
-              <w:t>区间密度测量</w:t>
+            <w:r>
+              <w:t xml:space="preserve">  1. 分布测量</w:t>
             </w:r>
           </w:p>
         </w:tc>
@@ -3281,18 +2831,8 @@
             </w:tcMar>
           </w:tcPr>
           <w:p>
-            <w:pPr>
-              <w:spacing w:after="0" w:line="240" w:lineRule="auto" w:before="0"/>
-              <w:jc w:val="left"/>
-            </w:pPr>
-            <w:r>
-              <w:rPr>
-                <w:rFonts w:ascii="Arial" w:hAnsi="Arial" w:eastAsia="Microsoft YaHei"/>
-                <w:b w:val="0"/>
-                <w:color w:val="232323"/>
-                <w:sz w:val="17"/>
-              </w:rPr>
-              <w:t>按设定区间执行密度测量。</w:t>
+            <w:r>
+              <w:t>执行密度分布测量。</w:t>
             </w:r>
           </w:p>
         </w:tc>
@@ -3329,18 +2869,8 @@
             </w:tcMar>
           </w:tcPr>
           <w:p>
-            <w:pPr>
-              <w:spacing w:after="0" w:line="240" w:lineRule="auto" w:before="0"/>
-              <w:jc w:val="left"/>
-            </w:pPr>
-            <w:r>
-              <w:rPr>
-                <w:rFonts w:ascii="Arial" w:hAnsi="Arial" w:eastAsia="Microsoft YaHei"/>
-                <w:b w:val="0"/>
-                <w:color w:val="232323"/>
-                <w:sz w:val="17"/>
-              </w:rPr>
-              <w:t>瓦锡兰区间密度</w:t>
+            <w:r>
+              <w:t xml:space="preserve">  2. 国标分布测量</w:t>
             </w:r>
           </w:p>
         </w:tc>
@@ -3356,18 +2886,8 @@
             </w:tcMar>
           </w:tcPr>
           <w:p>
-            <w:pPr>
-              <w:spacing w:after="0" w:line="240" w:lineRule="auto" w:before="0"/>
-              <w:jc w:val="left"/>
-            </w:pPr>
-            <w:r>
-              <w:rPr>
-                <w:rFonts w:ascii="Arial" w:hAnsi="Arial" w:eastAsia="Microsoft YaHei"/>
-                <w:b w:val="0"/>
-                <w:color w:val="232323"/>
-                <w:sz w:val="17"/>
-              </w:rPr>
-              <w:t>执行瓦锡兰区间密度测量流程。</w:t>
+            <w:r>
+              <w:t>执行国标密度分布测量。</w:t>
             </w:r>
           </w:p>
         </w:tc>
@@ -3404,18 +2924,8 @@
             </w:tcMar>
           </w:tcPr>
           <w:p>
-            <w:pPr>
-              <w:spacing w:after="0" w:line="240" w:lineRule="auto" w:before="0"/>
-              <w:jc w:val="left"/>
-            </w:pPr>
-            <w:r>
-              <w:rPr>
-                <w:rFonts w:ascii="Arial" w:hAnsi="Arial" w:eastAsia="Microsoft YaHei"/>
-                <w:b w:val="0"/>
-                <w:color w:val="232323"/>
-                <w:sz w:val="17"/>
-              </w:rPr>
-              <w:t>读取部件参数</w:t>
+            <w:r>
+              <w:t xml:space="preserve">  3. 密度每米测量</w:t>
             </w:r>
           </w:p>
         </w:tc>
@@ -3431,18 +2941,8 @@
             </w:tcMar>
           </w:tcPr>
           <w:p>
-            <w:pPr>
-              <w:spacing w:after="0" w:line="240" w:lineRule="auto" w:before="0"/>
-              <w:jc w:val="left"/>
-            </w:pPr>
-            <w:r>
-              <w:rPr>
-                <w:rFonts w:ascii="Arial" w:hAnsi="Arial" w:eastAsia="Microsoft YaHei"/>
-                <w:b w:val="0"/>
-                <w:color w:val="232323"/>
-                <w:sz w:val="17"/>
-              </w:rPr>
-              <w:t>读取部件参数信息。</w:t>
+            <w:r>
+              <w:t>按每米间隔执行密度测量。</w:t>
             </w:r>
           </w:p>
         </w:tc>
@@ -3479,44 +2979,90 @@
             </w:tcMar>
           </w:tcPr>
           <w:p>
-            <w:pPr>
-              <w:spacing w:after="0" w:line="240" w:lineRule="auto" w:before="0"/>
-              <w:jc w:val="left"/>
-            </w:pPr>
-            <w:r>
-              <w:rPr>
-                <w:rFonts w:ascii="Arial" w:hAnsi="Arial" w:eastAsia="Microsoft YaHei"/>
-                <w:b w:val="0"/>
-                <w:color w:val="232323"/>
-                <w:sz w:val="17"/>
-              </w:rPr>
+            <w:r>
+              <w:t xml:space="preserve">  4. 区间密度测量</w:t>
+            </w:r>
+          </w:p>
+        </w:tc>
+        <w:tc>
+          <w:tcPr>
+            <w:tcW w:w="11736" w:type="dxa"/>
+            <w:vAlign w:val="center"/>
+            <w:tcMar>
+              <w:top w:w="45" w:type="dxa"/>
+              <w:start w:w="55" w:type="dxa"/>
+              <w:bottom w:w="45" w:type="dxa"/>
+              <w:end w:w="55" w:type="dxa"/>
+            </w:tcMar>
+          </w:tcPr>
+          <w:p>
+            <w:r>
+              <w:t>按设定区间执行密度测量。</w:t>
+            </w:r>
+          </w:p>
+        </w:tc>
+      </w:tr>
+      <w:tr>
+        <w:tc>
+          <w:tcPr>
+            <w:tcW w:type="dxa" w:w="7296"/>
+          </w:tcPr>
+          <w:p>
+            <w:r>
+              <w:t xml:space="preserve">  5. 瓦锡兰区间密度</w:t>
+            </w:r>
+          </w:p>
+        </w:tc>
+        <w:tc>
+          <w:tcPr>
+            <w:tcW w:type="dxa" w:w="7296"/>
+          </w:tcPr>
+          <w:p>
+            <w:r>
+              <w:t>执行瓦锡兰区间密度测量流程。</w:t>
+            </w:r>
+          </w:p>
+        </w:tc>
+      </w:tr>
+      <w:tr>
+        <w:tc>
+          <w:tcPr>
+            <w:tcW w:type="dxa" w:w="7296"/>
+          </w:tcPr>
+          <w:p>
+            <w:r>
+              <w:t>浮子运行到高度</w:t>
+            </w:r>
+          </w:p>
+        </w:tc>
+        <w:tc>
+          <w:tcPr>
+            <w:tcW w:type="dxa" w:w="7296"/>
+          </w:tcPr>
+          <w:p>
+            <w:r>
+              <w:t>控制浮子运行到指定高度；仍作为普通测量命令入口。</w:t>
+            </w:r>
+          </w:p>
+        </w:tc>
+      </w:tr>
+      <w:tr>
+        <w:tc>
+          <w:tcPr>
+            <w:tcW w:type="dxa" w:w="7296"/>
+          </w:tcPr>
+          <w:p>
+            <w:r>
               <w:t>退出</w:t>
             </w:r>
           </w:p>
         </w:tc>
         <w:tc>
           <w:tcPr>
-            <w:tcW w:w="11736" w:type="dxa"/>
-            <w:vAlign w:val="center"/>
-            <w:tcMar>
-              <w:top w:w="45" w:type="dxa"/>
-              <w:start w:w="55" w:type="dxa"/>
-              <w:bottom w:w="45" w:type="dxa"/>
-              <w:end w:w="55" w:type="dxa"/>
-            </w:tcMar>
-          </w:tcPr>
-          <w:p>
-            <w:pPr>
-              <w:spacing w:after="0" w:line="240" w:lineRule="auto" w:before="0"/>
-              <w:jc w:val="left"/>
-            </w:pPr>
-            <w:r>
-              <w:rPr>
-                <w:rFonts w:ascii="Arial" w:hAnsi="Arial" w:eastAsia="Microsoft YaHei"/>
-                <w:b w:val="0"/>
-                <w:color w:val="232323"/>
-                <w:sz w:val="17"/>
-              </w:rPr>
+            <w:tcW w:type="dxa" w:w="7296"/>
+          </w:tcPr>
+          <w:p>
+            <w:r>
               <w:t>返回主菜单。</w:t>
             </w:r>
           </w:p>
@@ -3527,6 +3073,9 @@
       <w:pPr>
         <w:spacing w:after="20" w:line="252" w:lineRule="auto"/>
       </w:pPr>
+      <w:r>
+        <w:t>测量命令首页按现场操作语义聚合，读取部件参数位于第 6 位；水位单次测量和水位跟随放入水位测量，密度测量拆分为密度单点测量和密度分布测量。</w:t>
+      </w:r>
     </w:p>
     <w:p>
       <w:pPr>
@@ -3603,17 +3152,7 @@
             </w:tcMar>
           </w:tcPr>
           <w:p>
-            <w:pPr>
-              <w:spacing w:after="0" w:line="240" w:lineRule="auto" w:before="0"/>
-              <w:jc w:val="center"/>
-            </w:pPr>
-            <w:r>
-              <w:rPr>
-                <w:rFonts w:ascii="Arial" w:hAnsi="Arial" w:eastAsia="Microsoft YaHei"/>
-                <w:b/>
-                <w:color w:val="232323"/>
-                <w:sz w:val="17"/>
-              </w:rPr>
+            <w:r>
               <w:t>菜单项</w:t>
             </w:r>
           </w:p>
@@ -3631,17 +3170,7 @@
             </w:tcMar>
           </w:tcPr>
           <w:p>
-            <w:pPr>
-              <w:spacing w:after="0" w:line="240" w:lineRule="auto" w:before="0"/>
-              <w:jc w:val="center"/>
-            </w:pPr>
-            <w:r>
-              <w:rPr>
-                <w:rFonts w:ascii="Arial" w:hAnsi="Arial" w:eastAsia="Microsoft YaHei"/>
-                <w:b/>
-                <w:color w:val="232323"/>
-                <w:sz w:val="17"/>
-              </w:rPr>
+            <w:r>
               <w:t>说明/现场设置值</w:t>
             </w:r>
           </w:p>
@@ -3679,18 +3208,8 @@
             </w:tcMar>
           </w:tcPr>
           <w:p>
-            <w:pPr>
-              <w:spacing w:after="0" w:line="240" w:lineRule="auto" w:before="0"/>
-              <w:jc w:val="left"/>
-            </w:pPr>
-            <w:r>
-              <w:rPr>
-                <w:rFonts w:ascii="Arial" w:hAnsi="Arial" w:eastAsia="Microsoft YaHei"/>
-                <w:b w:val="0"/>
-                <w:color w:val="232323"/>
-                <w:sz w:val="17"/>
-              </w:rPr>
-              <w:t>上行</w:t>
+            <w:r>
+              <w:t>浮子运动控制</w:t>
             </w:r>
           </w:p>
         </w:tc>
@@ -3706,18 +3225,8 @@
             </w:tcMar>
           </w:tcPr>
           <w:p>
-            <w:pPr>
-              <w:spacing w:after="0" w:line="240" w:lineRule="auto" w:before="0"/>
-              <w:jc w:val="left"/>
-            </w:pPr>
-            <w:r>
-              <w:rPr>
-                <w:rFonts w:ascii="Arial" w:hAnsi="Arial" w:eastAsia="Microsoft YaHei"/>
-                <w:b w:val="0"/>
-                <w:color w:val="232323"/>
-                <w:sz w:val="17"/>
-              </w:rPr>
-              <w:t>点动/执行上行控制。</w:t>
+            <w:r>
+              <w:t>控制传感器/浮子移动的调试子菜单。</w:t>
             </w:r>
           </w:p>
         </w:tc>
@@ -3754,18 +3263,8 @@
             </w:tcMar>
           </w:tcPr>
           <w:p>
-            <w:pPr>
-              <w:spacing w:after="0" w:line="240" w:lineRule="auto" w:before="0"/>
-              <w:jc w:val="left"/>
-            </w:pPr>
-            <w:r>
-              <w:rPr>
-                <w:rFonts w:ascii="Arial" w:hAnsi="Arial" w:eastAsia="Microsoft YaHei"/>
-                <w:b w:val="0"/>
-                <w:color w:val="232323"/>
-                <w:sz w:val="17"/>
-              </w:rPr>
-              <w:t>下行</w:t>
+            <w:r>
+              <w:t xml:space="preserve">  1. 上行</w:t>
             </w:r>
           </w:p>
         </w:tc>
@@ -3781,18 +3280,8 @@
             </w:tcMar>
           </w:tcPr>
           <w:p>
-            <w:pPr>
-              <w:spacing w:after="0" w:line="240" w:lineRule="auto" w:before="0"/>
-              <w:jc w:val="left"/>
-            </w:pPr>
-            <w:r>
-              <w:rPr>
-                <w:rFonts w:ascii="Arial" w:hAnsi="Arial" w:eastAsia="Microsoft YaHei"/>
-                <w:b w:val="0"/>
-                <w:color w:val="232323"/>
-                <w:sz w:val="17"/>
-              </w:rPr>
-              <w:t>点动/执行下行控制。</w:t>
+            <w:r>
+              <w:t>按输入距离执行上行控制。</w:t>
             </w:r>
           </w:p>
         </w:tc>
@@ -3829,18 +3318,8 @@
             </w:tcMar>
           </w:tcPr>
           <w:p>
-            <w:pPr>
-              <w:spacing w:after="0" w:line="240" w:lineRule="auto" w:before="0"/>
-              <w:jc w:val="left"/>
-            </w:pPr>
-            <w:r>
-              <w:rPr>
-                <w:rFonts w:ascii="Arial" w:hAnsi="Arial" w:eastAsia="Microsoft YaHei"/>
-                <w:b w:val="0"/>
-                <w:color w:val="232323"/>
-                <w:sz w:val="17"/>
-              </w:rPr>
-              <w:t>强制上行</w:t>
+            <w:r>
+              <w:t xml:space="preserve">  2. 下行</w:t>
             </w:r>
           </w:p>
         </w:tc>
@@ -3856,18 +3335,8 @@
             </w:tcMar>
           </w:tcPr>
           <w:p>
-            <w:pPr>
-              <w:spacing w:after="0" w:line="240" w:lineRule="auto" w:before="0"/>
-              <w:jc w:val="left"/>
-            </w:pPr>
-            <w:r>
-              <w:rPr>
-                <w:rFonts w:ascii="Arial" w:hAnsi="Arial" w:eastAsia="Microsoft YaHei"/>
-                <w:b w:val="0"/>
-                <w:color w:val="232323"/>
-                <w:sz w:val="17"/>
-              </w:rPr>
-              <w:t>强制执行上行控制。</w:t>
+            <w:r>
+              <w:t>按输入距离执行下行控制。</w:t>
             </w:r>
           </w:p>
         </w:tc>
@@ -3904,18 +3373,8 @@
             </w:tcMar>
           </w:tcPr>
           <w:p>
-            <w:pPr>
-              <w:spacing w:after="0" w:line="240" w:lineRule="auto" w:before="0"/>
-              <w:jc w:val="left"/>
-            </w:pPr>
-            <w:r>
-              <w:rPr>
-                <w:rFonts w:ascii="Arial" w:hAnsi="Arial" w:eastAsia="Microsoft YaHei"/>
-                <w:b w:val="0"/>
-                <w:color w:val="232323"/>
-                <w:sz w:val="17"/>
-              </w:rPr>
-              <w:t>强制下行</w:t>
+            <w:r>
+              <w:t xml:space="preserve">  3. 强制上行</w:t>
             </w:r>
           </w:p>
         </w:tc>
@@ -3931,18 +3390,8 @@
             </w:tcMar>
           </w:tcPr>
           <w:p>
-            <w:pPr>
-              <w:spacing w:after="0" w:line="240" w:lineRule="auto" w:before="0"/>
-              <w:jc w:val="left"/>
-            </w:pPr>
-            <w:r>
-              <w:rPr>
-                <w:rFonts w:ascii="Arial" w:hAnsi="Arial" w:eastAsia="Microsoft YaHei"/>
-                <w:b w:val="0"/>
-                <w:color w:val="232323"/>
-                <w:sz w:val="17"/>
-              </w:rPr>
-              <w:t>强制执行下行控制。</w:t>
+            <w:r>
+              <w:t>强制执行上行控制。</w:t>
             </w:r>
           </w:p>
         </w:tc>
@@ -3979,18 +3428,8 @@
             </w:tcMar>
           </w:tcPr>
           <w:p>
-            <w:pPr>
-              <w:spacing w:after="0" w:line="240" w:lineRule="auto" w:before="0"/>
-              <w:jc w:val="left"/>
-            </w:pPr>
-            <w:r>
-              <w:rPr>
-                <w:rFonts w:ascii="Arial" w:hAnsi="Arial" w:eastAsia="Microsoft YaHei"/>
-                <w:b w:val="0"/>
-                <w:color w:val="232323"/>
-                <w:sz w:val="17"/>
-              </w:rPr>
-              <w:t>强制提零点</w:t>
+            <w:r>
+              <w:t xml:space="preserve">  4. 强制下行</w:t>
             </w:r>
           </w:p>
         </w:tc>
@@ -4006,18 +3445,8 @@
             </w:tcMar>
           </w:tcPr>
           <w:p>
-            <w:pPr>
-              <w:spacing w:after="0" w:line="240" w:lineRule="auto" w:before="0"/>
-              <w:jc w:val="left"/>
-            </w:pPr>
-            <w:r>
-              <w:rPr>
-                <w:rFonts w:ascii="Arial" w:hAnsi="Arial" w:eastAsia="Microsoft YaHei"/>
-                <w:b w:val="0"/>
-                <w:color w:val="232323"/>
-                <w:sz w:val="17"/>
-              </w:rPr>
-              <w:t>强制执行提零点控制。</w:t>
+            <w:r>
+              <w:t>强制执行下行控制。</w:t>
             </w:r>
           </w:p>
         </w:tc>
@@ -4054,18 +3483,8 @@
             </w:tcMar>
           </w:tcPr>
           <w:p>
-            <w:pPr>
-              <w:spacing w:after="0" w:line="240" w:lineRule="auto" w:before="0"/>
-              <w:jc w:val="left"/>
-            </w:pPr>
-            <w:r>
-              <w:rPr>
-                <w:rFonts w:ascii="Arial" w:hAnsi="Arial" w:eastAsia="Microsoft YaHei"/>
-                <w:b w:val="0"/>
-                <w:color w:val="232323"/>
-                <w:sz w:val="17"/>
-              </w:rPr>
-              <w:t>标定零点</w:t>
+            <w:r>
+              <w:t xml:space="preserve">  5. 强制提零点</w:t>
             </w:r>
           </w:p>
         </w:tc>
@@ -4081,18 +3500,8 @@
             </w:tcMar>
           </w:tcPr>
           <w:p>
-            <w:pPr>
-              <w:spacing w:after="0" w:line="240" w:lineRule="auto" w:before="0"/>
-              <w:jc w:val="left"/>
-            </w:pPr>
-            <w:r>
-              <w:rPr>
-                <w:rFonts w:ascii="Arial" w:hAnsi="Arial" w:eastAsia="Microsoft YaHei"/>
-                <w:b w:val="0"/>
-                <w:color w:val="232323"/>
-                <w:sz w:val="17"/>
-              </w:rPr>
-              <w:t>进入零点标定流程。</w:t>
+            <w:r>
+              <w:t>强制执行提零点控制。</w:t>
             </w:r>
           </w:p>
         </w:tc>
@@ -4129,18 +3538,8 @@
             </w:tcMar>
           </w:tcPr>
           <w:p>
-            <w:pPr>
-              <w:spacing w:after="0" w:line="240" w:lineRule="auto" w:before="0"/>
-              <w:jc w:val="left"/>
-            </w:pPr>
-            <w:r>
-              <w:rPr>
-                <w:rFonts w:ascii="Arial" w:hAnsi="Arial" w:eastAsia="Microsoft YaHei"/>
-                <w:b w:val="0"/>
-                <w:color w:val="232323"/>
-                <w:sz w:val="17"/>
-              </w:rPr>
-              <w:t>标定液位</w:t>
+            <w:r>
+              <w:t>标定修正</w:t>
             </w:r>
           </w:p>
         </w:tc>
@@ -4156,18 +3555,8 @@
             </w:tcMar>
           </w:tcPr>
           <w:p>
-            <w:pPr>
-              <w:spacing w:after="0" w:line="240" w:lineRule="auto" w:before="0"/>
-              <w:jc w:val="left"/>
-            </w:pPr>
-            <w:r>
-              <w:rPr>
-                <w:rFonts w:ascii="Arial" w:hAnsi="Arial" w:eastAsia="Microsoft YaHei"/>
-                <w:b w:val="0"/>
-                <w:color w:val="232323"/>
-                <w:sz w:val="17"/>
-              </w:rPr>
-              <w:t>进入液位标定流程。</w:t>
+            <w:r>
+              <w:t>零点、液位、水位和罐高标定修正子菜单。</w:t>
             </w:r>
           </w:p>
         </w:tc>
@@ -4204,18 +3593,8 @@
             </w:tcMar>
           </w:tcPr>
           <w:p>
-            <w:pPr>
-              <w:spacing w:after="0" w:line="240" w:lineRule="auto" w:before="0"/>
-              <w:jc w:val="left"/>
-            </w:pPr>
-            <w:r>
-              <w:rPr>
-                <w:rFonts w:ascii="Arial" w:hAnsi="Arial" w:eastAsia="Microsoft YaHei"/>
-                <w:b w:val="0"/>
-                <w:color w:val="232323"/>
-                <w:sz w:val="17"/>
-              </w:rPr>
-              <w:t>修正液位</w:t>
+            <w:r>
+              <w:t xml:space="preserve">  1. 标定零点</w:t>
             </w:r>
           </w:p>
         </w:tc>
@@ -4231,18 +3610,8 @@
             </w:tcMar>
           </w:tcPr>
           <w:p>
-            <w:pPr>
-              <w:spacing w:after="0" w:line="240" w:lineRule="auto" w:before="0"/>
-              <w:jc w:val="left"/>
-            </w:pPr>
-            <w:r>
-              <w:rPr>
-                <w:rFonts w:ascii="Arial" w:hAnsi="Arial" w:eastAsia="Microsoft YaHei"/>
-                <w:b w:val="0"/>
-                <w:color w:val="232323"/>
-                <w:sz w:val="17"/>
-              </w:rPr>
-              <w:t>进入液位修正流程。</w:t>
+            <w:r>
+              <w:t>进入零点标定流程。</w:t>
             </w:r>
           </w:p>
         </w:tc>
@@ -4279,18 +3648,8 @@
             </w:tcMar>
           </w:tcPr>
           <w:p>
-            <w:pPr>
-              <w:spacing w:after="0" w:line="240" w:lineRule="auto" w:before="0"/>
-              <w:jc w:val="left"/>
-            </w:pPr>
-            <w:r>
-              <w:rPr>
-                <w:rFonts w:ascii="Arial" w:hAnsi="Arial" w:eastAsia="Microsoft YaHei"/>
-                <w:b w:val="0"/>
-                <w:color w:val="232323"/>
-                <w:sz w:val="17"/>
-              </w:rPr>
-              <w:t>标定水位</w:t>
+            <w:r>
+              <w:t xml:space="preserve">  2. 标定液位</w:t>
             </w:r>
           </w:p>
         </w:tc>
@@ -4306,18 +3665,8 @@
             </w:tcMar>
           </w:tcPr>
           <w:p>
-            <w:pPr>
-              <w:spacing w:after="0" w:line="240" w:lineRule="auto" w:before="0"/>
-              <w:jc w:val="left"/>
-            </w:pPr>
-            <w:r>
-              <w:rPr>
-                <w:rFonts w:ascii="Arial" w:hAnsi="Arial" w:eastAsia="Microsoft YaHei"/>
-                <w:b w:val="0"/>
-                <w:color w:val="232323"/>
-                <w:sz w:val="17"/>
-              </w:rPr>
-              <w:t>进入水位标定流程。</w:t>
+            <w:r>
+              <w:t>进入液位标定流程。</w:t>
             </w:r>
           </w:p>
         </w:tc>
@@ -4354,18 +3703,8 @@
             </w:tcMar>
           </w:tcPr>
           <w:p>
-            <w:pPr>
-              <w:spacing w:after="0" w:line="240" w:lineRule="auto" w:before="0"/>
-              <w:jc w:val="left"/>
-            </w:pPr>
-            <w:r>
-              <w:rPr>
-                <w:rFonts w:ascii="Arial" w:hAnsi="Arial" w:eastAsia="Microsoft YaHei"/>
-                <w:b w:val="0"/>
-                <w:color w:val="232323"/>
-                <w:sz w:val="17"/>
-              </w:rPr>
-              <w:t>标定罐高</w:t>
+            <w:r>
+              <w:t xml:space="preserve">  3. 修正液位</w:t>
             </w:r>
           </w:p>
         </w:tc>
@@ -4381,18 +3720,8 @@
             </w:tcMar>
           </w:tcPr>
           <w:p>
-            <w:pPr>
-              <w:spacing w:after="0" w:line="240" w:lineRule="auto" w:before="0"/>
-              <w:jc w:val="left"/>
-            </w:pPr>
-            <w:r>
-              <w:rPr>
-                <w:rFonts w:ascii="Arial" w:hAnsi="Arial" w:eastAsia="Microsoft YaHei"/>
-                <w:b w:val="0"/>
-                <w:color w:val="232323"/>
-                <w:sz w:val="17"/>
-              </w:rPr>
-              <w:t>进入罐高标定流程。</w:t>
+            <w:r>
+              <w:t>进入液位修正流程。</w:t>
             </w:r>
           </w:p>
         </w:tc>
@@ -4429,18 +3758,8 @@
             </w:tcMar>
           </w:tcPr>
           <w:p>
-            <w:pPr>
-              <w:spacing w:after="0" w:line="240" w:lineRule="auto" w:before="0"/>
-              <w:jc w:val="left"/>
-            </w:pPr>
-            <w:r>
-              <w:rPr>
-                <w:rFonts w:ascii="Arial" w:hAnsi="Arial" w:eastAsia="Microsoft YaHei"/>
-                <w:b w:val="0"/>
-                <w:color w:val="232323"/>
-                <w:sz w:val="17"/>
-              </w:rPr>
-              <w:t>获取空载称重</w:t>
+            <w:r>
+              <w:t xml:space="preserve">  4. 标定水位</w:t>
             </w:r>
           </w:p>
         </w:tc>
@@ -4456,18 +3775,8 @@
             </w:tcMar>
           </w:tcPr>
           <w:p>
-            <w:pPr>
-              <w:spacing w:after="0" w:line="240" w:lineRule="auto" w:before="0"/>
-              <w:jc w:val="left"/>
-            </w:pPr>
-            <w:r>
-              <w:rPr>
-                <w:rFonts w:ascii="Arial" w:hAnsi="Arial" w:eastAsia="Microsoft YaHei"/>
-                <w:b w:val="0"/>
-                <w:color w:val="232323"/>
-                <w:sz w:val="17"/>
-              </w:rPr>
-              <w:t>采集空载称重值。</w:t>
+            <w:r>
+              <w:t>进入水位标定流程。</w:t>
             </w:r>
           </w:p>
         </w:tc>
@@ -4504,18 +3813,8 @@
             </w:tcMar>
           </w:tcPr>
           <w:p>
-            <w:pPr>
-              <w:spacing w:after="0" w:line="240" w:lineRule="auto" w:before="0"/>
-              <w:jc w:val="left"/>
-            </w:pPr>
-            <w:r>
-              <w:rPr>
-                <w:rFonts w:ascii="Arial" w:hAnsi="Arial" w:eastAsia="Microsoft YaHei"/>
-                <w:b w:val="0"/>
-                <w:color w:val="232323"/>
-                <w:sz w:val="17"/>
-              </w:rPr>
-              <w:t>获取满载称重</w:t>
+            <w:r>
+              <w:t xml:space="preserve">  5. 标定罐高</w:t>
             </w:r>
           </w:p>
         </w:tc>
@@ -4531,18 +3830,8 @@
             </w:tcMar>
           </w:tcPr>
           <w:p>
-            <w:pPr>
-              <w:spacing w:after="0" w:line="240" w:lineRule="auto" w:before="0"/>
-              <w:jc w:val="left"/>
-            </w:pPr>
-            <w:r>
-              <w:rPr>
-                <w:rFonts w:ascii="Arial" w:hAnsi="Arial" w:eastAsia="Microsoft YaHei"/>
-                <w:b w:val="0"/>
-                <w:color w:val="232323"/>
-                <w:sz w:val="17"/>
-              </w:rPr>
-              <w:t>采集满载称重值。</w:t>
+            <w:r>
+              <w:t>进入罐高标定流程。</w:t>
             </w:r>
           </w:p>
         </w:tc>
@@ -4579,18 +3868,8 @@
             </w:tcMar>
           </w:tcPr>
           <w:p>
-            <w:pPr>
-              <w:spacing w:after="0" w:line="240" w:lineRule="auto" w:before="0"/>
-              <w:jc w:val="left"/>
-            </w:pPr>
-            <w:r>
-              <w:rPr>
-                <w:rFonts w:ascii="Arial" w:hAnsi="Arial" w:eastAsia="Microsoft YaHei"/>
-                <w:b w:val="0"/>
-                <w:color w:val="232323"/>
-                <w:sz w:val="17"/>
-              </w:rPr>
-              <w:t>恢复出厂设置</w:t>
+            <w:r>
+              <w:t>称重标定</w:t>
             </w:r>
           </w:p>
         </w:tc>
@@ -4606,18 +3885,8 @@
             </w:tcMar>
           </w:tcPr>
           <w:p>
-            <w:pPr>
-              <w:spacing w:after="0" w:line="240" w:lineRule="auto" w:before="0"/>
-              <w:jc w:val="left"/>
-            </w:pPr>
-            <w:r>
-              <w:rPr>
-                <w:rFonts w:ascii="Arial" w:hAnsi="Arial" w:eastAsia="Microsoft YaHei"/>
-                <w:b w:val="0"/>
-                <w:color w:val="232323"/>
-                <w:sz w:val="17"/>
-              </w:rPr>
-              <w:t>执行恢复出厂设置。</w:t>
+            <w:r>
+              <w:t>空载/满载称重获取子菜单。</w:t>
             </w:r>
           </w:p>
         </w:tc>
@@ -4654,18 +3923,8 @@
             </w:tcMar>
           </w:tcPr>
           <w:p>
-            <w:pPr>
-              <w:spacing w:after="0" w:line="240" w:lineRule="auto" w:before="0"/>
-              <w:jc w:val="left"/>
-            </w:pPr>
-            <w:r>
-              <w:rPr>
-                <w:rFonts w:ascii="Arial" w:hAnsi="Arial" w:eastAsia="Microsoft YaHei"/>
-                <w:b w:val="0"/>
-                <w:color w:val="232323"/>
-                <w:sz w:val="17"/>
-              </w:rPr>
-              <w:t>进入维护模式</w:t>
+            <w:r>
+              <w:t xml:space="preserve">  1. 获取空载称重</w:t>
             </w:r>
           </w:p>
         </w:tc>
@@ -4681,18 +3940,8 @@
             </w:tcMar>
           </w:tcPr>
           <w:p>
-            <w:pPr>
-              <w:spacing w:after="0" w:line="240" w:lineRule="auto" w:before="0"/>
-              <w:jc w:val="left"/>
-            </w:pPr>
-            <w:r>
-              <w:rPr>
-                <w:rFonts w:ascii="Arial" w:hAnsi="Arial" w:eastAsia="Microsoft YaHei"/>
-                <w:b w:val="0"/>
-                <w:color w:val="232323"/>
-                <w:sz w:val="17"/>
-              </w:rPr>
-              <w:t>进入维护/工厂模式。</w:t>
+            <w:r>
+              <w:t>下发后显示“获取空载称重中”等待页和当前称重值；完成后返回称重标定菜单，故障时回状态/故障页。</w:t>
             </w:r>
           </w:p>
         </w:tc>
@@ -4729,44 +3978,156 @@
             </w:tcMar>
           </w:tcPr>
           <w:p>
-            <w:pPr>
-              <w:spacing w:after="0" w:line="240" w:lineRule="auto" w:before="0"/>
-              <w:jc w:val="left"/>
-            </w:pPr>
-            <w:r>
-              <w:rPr>
-                <w:rFonts w:ascii="Arial" w:hAnsi="Arial" w:eastAsia="Microsoft YaHei"/>
-                <w:b w:val="0"/>
-                <w:color w:val="232323"/>
-                <w:sz w:val="17"/>
-              </w:rPr>
+            <w:r>
+              <w:t xml:space="preserve">  2. 获取满载称重</w:t>
+            </w:r>
+          </w:p>
+        </w:tc>
+        <w:tc>
+          <w:tcPr>
+            <w:tcW w:w="11736" w:type="dxa"/>
+            <w:vAlign w:val="center"/>
+            <w:tcMar>
+              <w:top w:w="45" w:type="dxa"/>
+              <w:start w:w="55" w:type="dxa"/>
+              <w:bottom w:w="45" w:type="dxa"/>
+              <w:end w:w="55" w:type="dxa"/>
+            </w:tcMar>
+          </w:tcPr>
+          <w:p>
+            <w:r>
+              <w:t>下发后显示“获取满载称重中”等待页和当前称重值；完成后返回称重标定菜单，故障时回状态/故障页。</w:t>
+            </w:r>
+          </w:p>
+        </w:tc>
+      </w:tr>
+      <w:tr>
+        <w:tc>
+          <w:tcPr>
+            <w:tcW w:type="dxa" w:w="7296"/>
+          </w:tcPr>
+          <w:p>
+            <w:r>
+              <w:t>无线维护</w:t>
+            </w:r>
+          </w:p>
+        </w:tc>
+        <w:tc>
+          <w:tcPr>
+            <w:tcW w:type="dxa" w:w="7296"/>
+          </w:tcPr>
+          <w:p>
+            <w:r>
+              <w:t>无线滑环维护子菜单。</w:t>
+            </w:r>
+          </w:p>
+        </w:tc>
+      </w:tr>
+      <w:tr>
+        <w:tc>
+          <w:tcPr>
+            <w:tcW w:type="dxa" w:w="7296"/>
+          </w:tcPr>
+          <w:p>
+            <w:r>
+              <w:t xml:space="preserve">  1. 匹配无线滑环</w:t>
+            </w:r>
+          </w:p>
+        </w:tc>
+        <w:tc>
+          <w:tcPr>
+            <w:tcW w:type="dxa" w:w="7296"/>
+          </w:tcPr>
+          <w:p>
+            <w:r>
+              <w:t>匹配最近无线滑环。</w:t>
+            </w:r>
+          </w:p>
+        </w:tc>
+      </w:tr>
+      <w:tr>
+        <w:tc>
+          <w:tcPr>
+            <w:tcW w:type="dxa" w:w="7296"/>
+          </w:tcPr>
+          <w:p>
+            <w:r>
+              <w:t>系统维护</w:t>
+            </w:r>
+          </w:p>
+        </w:tc>
+        <w:tc>
+          <w:tcPr>
+            <w:tcW w:type="dxa" w:w="7296"/>
+          </w:tcPr>
+          <w:p>
+            <w:r>
+              <w:t>系统维护子菜单。</w:t>
+            </w:r>
+          </w:p>
+        </w:tc>
+      </w:tr>
+      <w:tr>
+        <w:tc>
+          <w:tcPr>
+            <w:tcW w:type="dxa" w:w="7296"/>
+          </w:tcPr>
+          <w:p>
+            <w:r>
+              <w:t xml:space="preserve">  1. 进入维护模式</w:t>
+            </w:r>
+          </w:p>
+        </w:tc>
+        <w:tc>
+          <w:tcPr>
+            <w:tcW w:type="dxa" w:w="7296"/>
+          </w:tcPr>
+          <w:p>
+            <w:r>
+              <w:t>进入维护/工厂模式。</w:t>
+            </w:r>
+          </w:p>
+        </w:tc>
+      </w:tr>
+      <w:tr>
+        <w:tc>
+          <w:tcPr>
+            <w:tcW w:type="dxa" w:w="7296"/>
+          </w:tcPr>
+          <w:p>
+            <w:r>
+              <w:t xml:space="preserve">  2. 恢复出厂设置</w:t>
+            </w:r>
+          </w:p>
+        </w:tc>
+        <w:tc>
+          <w:tcPr>
+            <w:tcW w:type="dxa" w:w="7296"/>
+          </w:tcPr>
+          <w:p>
+            <w:r>
+              <w:t>执行恢复出厂设置，保存前触发参数保护确认。</w:t>
+            </w:r>
+          </w:p>
+        </w:tc>
+      </w:tr>
+      <w:tr>
+        <w:tc>
+          <w:tcPr>
+            <w:tcW w:type="dxa" w:w="7296"/>
+          </w:tcPr>
+          <w:p>
+            <w:r>
               <w:t>退出</w:t>
             </w:r>
           </w:p>
         </w:tc>
         <w:tc>
           <w:tcPr>
-            <w:tcW w:w="11736" w:type="dxa"/>
-            <w:vAlign w:val="center"/>
-            <w:tcMar>
-              <w:top w:w="45" w:type="dxa"/>
-              <w:start w:w="55" w:type="dxa"/>
-              <w:bottom w:w="45" w:type="dxa"/>
-              <w:end w:w="55" w:type="dxa"/>
-            </w:tcMar>
-          </w:tcPr>
-          <w:p>
-            <w:pPr>
-              <w:spacing w:after="0" w:line="240" w:lineRule="auto" w:before="0"/>
-              <w:jc w:val="left"/>
-            </w:pPr>
-            <w:r>
-              <w:rPr>
-                <w:rFonts w:ascii="Arial" w:hAnsi="Arial" w:eastAsia="Microsoft YaHei"/>
-                <w:b w:val="0"/>
-                <w:color w:val="232323"/>
-                <w:sz w:val="17"/>
-              </w:rPr>
+            <w:tcW w:type="dxa" w:w="7296"/>
+          </w:tcPr>
+          <w:p>
+            <w:r>
               <w:t>返回主菜单。</w:t>
             </w:r>
           </w:p>
@@ -4777,6 +4138,9 @@
       <w:pPr>
         <w:spacing w:after="20" w:line="252" w:lineRule="auto"/>
       </w:pPr>
+      <w:r>
+        <w:t>调试指令仍需要密码进入，上行、下行和强制运动类命令保留在调试指令边界内；获取空载/满载称重下发后进入独立等待页，完成后返回称重标定菜单。</w:t>
+      </w:r>
     </w:p>
     <w:p>
       <w:pPr>
@@ -4789,7 +4153,7 @@
           <w:color w:val="232323"/>
           <w:sz w:val="18"/>
         </w:rPr>
-        <w:t>参数配置首页按 5 类展示，现场可见参数按分组展开。标定液位值、修正液位值、标定水位值、标定罐高值、单点测量位置、单点监测位置、电机运行位置、电机上行/下行距离随测量或调试指令输入，不在参数配置首页单独显示。</w:t>
+        <w:t>六、参数配置菜单</w:t>
       </w:r>
     </w:p>
     <w:p>
@@ -4865,17 +4229,7 @@
             </w:tcMar>
           </w:tcPr>
           <w:p>
-            <w:pPr>
-              <w:spacing w:after="0" w:line="240" w:lineRule="auto" w:before="0"/>
-              <w:jc w:val="center"/>
-            </w:pPr>
-            <w:r>
-              <w:rPr>
-                <w:rFonts w:ascii="Arial" w:hAnsi="Arial" w:eastAsia="Microsoft YaHei"/>
-                <w:b/>
-                <w:color w:val="232323"/>
-                <w:sz w:val="17"/>
-              </w:rPr>
+            <w:r>
               <w:t>一级入口</w:t>
             </w:r>
           </w:p>
@@ -4893,17 +4247,7 @@
             </w:tcMar>
           </w:tcPr>
           <w:p>
-            <w:pPr>
-              <w:spacing w:after="0" w:line="240" w:lineRule="auto" w:before="0"/>
-              <w:jc w:val="center"/>
-            </w:pPr>
-            <w:r>
-              <w:rPr>
-                <w:rFonts w:ascii="Arial" w:hAnsi="Arial" w:eastAsia="Microsoft YaHei"/>
-                <w:b/>
-                <w:color w:val="232323"/>
-                <w:sz w:val="17"/>
-              </w:rPr>
+            <w:r>
               <w:t>二级入口</w:t>
             </w:r>
           </w:p>
@@ -4921,17 +4265,7 @@
             </w:tcMar>
           </w:tcPr>
           <w:p>
-            <w:pPr>
-              <w:spacing w:after="0" w:line="240" w:lineRule="auto" w:before="0"/>
-              <w:jc w:val="center"/>
-            </w:pPr>
-            <w:r>
-              <w:rPr>
-                <w:rFonts w:ascii="Arial" w:hAnsi="Arial" w:eastAsia="Microsoft YaHei"/>
-                <w:b/>
-                <w:color w:val="232323"/>
-                <w:sz w:val="17"/>
-              </w:rPr>
+            <w:r>
               <w:t>程序入口/说明</w:t>
             </w:r>
           </w:p>
@@ -4969,17 +4303,7 @@
             </w:tcMar>
           </w:tcPr>
           <w:p>
-            <w:pPr>
-              <w:spacing w:after="0" w:line="240" w:lineRule="auto" w:before="0"/>
-              <w:jc w:val="left"/>
-            </w:pPr>
-            <w:r>
-              <w:rPr>
-                <w:rFonts w:ascii="Arial" w:hAnsi="Arial" w:eastAsia="Microsoft YaHei"/>
-                <w:b w:val="0"/>
-                <w:color w:val="232323"/>
-                <w:sz w:val="17"/>
-              </w:rPr>
+            <w:r>
               <w:t>测量参数</w:t>
             </w:r>
           </w:p>
@@ -4996,17 +4320,7 @@
             </w:tcMar>
           </w:tcPr>
           <w:p>
-            <w:pPr>
-              <w:spacing w:after="0" w:line="240" w:lineRule="auto" w:before="0"/>
-              <w:jc w:val="left"/>
-            </w:pPr>
-            <w:r>
-              <w:rPr>
-                <w:rFonts w:ascii="Arial" w:hAnsi="Arial" w:eastAsia="Microsoft YaHei"/>
-                <w:b w:val="0"/>
-                <w:color w:val="232323"/>
-                <w:sz w:val="17"/>
-              </w:rPr>
+            <w:r>
               <w:t>运行设置、电机与编码参数、称重参数、零点参数、液位参数、水位参数、罐底与罐高、密度测量参数、Wartsila参数、修正参数</w:t>
             </w:r>
           </w:p>
@@ -5023,17 +4337,7 @@
             </w:tcMar>
           </w:tcPr>
           <w:p>
-            <w:pPr>
-              <w:spacing w:after="0" w:line="240" w:lineRule="auto" w:before="0"/>
-              <w:jc w:val="left"/>
-            </w:pPr>
-            <w:r>
-              <w:rPr>
-                <w:rFonts w:ascii="Arial" w:hAnsi="Arial" w:eastAsia="Microsoft YaHei"/>
-                <w:b w:val="0"/>
-                <w:color w:val="232323"/>
-                <w:sz w:val="17"/>
-              </w:rPr>
+            <w:r>
               <w:t>对应 menu_measure_config()，参数页由分组自动生成。</w:t>
             </w:r>
           </w:p>
@@ -5071,17 +4375,7 @@
             </w:tcMar>
           </w:tcPr>
           <w:p>
-            <w:pPr>
-              <w:spacing w:after="0" w:line="240" w:lineRule="auto" w:before="0"/>
-              <w:jc w:val="left"/>
-            </w:pPr>
-            <w:r>
-              <w:rPr>
-                <w:rFonts w:ascii="Arial" w:hAnsi="Arial" w:eastAsia="Microsoft YaHei"/>
-                <w:b w:val="0"/>
-                <w:color w:val="232323"/>
-                <w:sz w:val="17"/>
-              </w:rPr>
+            <w:r>
               <w:t>输出配置</w:t>
             </w:r>
           </w:p>
@@ -5098,17 +4392,7 @@
             </w:tcMar>
           </w:tcPr>
           <w:p>
-            <w:pPr>
-              <w:spacing w:after="0" w:line="240" w:lineRule="auto" w:before="0"/>
-              <w:jc w:val="left"/>
-            </w:pPr>
-            <w:r>
-              <w:rPr>
-                <w:rFonts w:ascii="Arial" w:hAnsi="Arial" w:eastAsia="Microsoft YaHei"/>
-                <w:b w:val="0"/>
-                <w:color w:val="232323"/>
-                <w:sz w:val="17"/>
-              </w:rPr>
+            <w:r>
               <w:t>继电器报警输出、AO输出</w:t>
             </w:r>
           </w:p>
@@ -5125,15 +4409,7 @@
             </w:tcMar>
           </w:tcPr>
           <w:p>
-            <w:pPr>
-              <w:spacing w:after="0" w:line="240" w:lineRule="auto" w:before="0"/>
-            </w:pPr>
-            <w:r>
-              <w:rPr>
-                <w:rFonts w:ascii="Arial" w:hAnsi="Arial" w:eastAsia="Microsoft YaHei"/>
-                <w:color w:val="232323"/>
-                <w:sz w:val="17"/>
-              </w:rPr>
+            <w:r>
               <w:t>继电器按 R1~R4 分页，每路再分“通道设置”“报警配置”和只读“报警状态”。</w:t>
             </w:r>
           </w:p>
@@ -5171,17 +4447,7 @@
             </w:tcMar>
           </w:tcPr>
           <w:p>
-            <w:pPr>
-              <w:spacing w:after="0" w:line="240" w:lineRule="auto" w:before="0"/>
-              <w:jc w:val="left"/>
-            </w:pPr>
-            <w:r>
-              <w:rPr>
-                <w:rFonts w:ascii="Arial" w:hAnsi="Arial" w:eastAsia="Microsoft YaHei"/>
-                <w:b w:val="0"/>
-                <w:color w:val="232323"/>
-                <w:sz w:val="17"/>
-              </w:rPr>
+            <w:r>
               <w:t>通信设置</w:t>
             </w:r>
           </w:p>
@@ -5198,17 +4464,7 @@
             </w:tcMar>
           </w:tcPr>
           <w:p>
-            <w:pPr>
-              <w:spacing w:after="0" w:line="240" w:lineRule="auto" w:before="0"/>
-              <w:jc w:val="left"/>
-            </w:pPr>
-            <w:r>
-              <w:rPr>
-                <w:rFonts w:ascii="Arial" w:hAnsi="Arial" w:eastAsia="Microsoft YaHei"/>
-                <w:b w:val="0"/>
-                <w:color w:val="232323"/>
-                <w:sz w:val="17"/>
-              </w:rPr>
+            <w:r>
               <w:t>COM1配置、COM2配置、COM3配置</w:t>
             </w:r>
           </w:p>
@@ -5225,17 +4481,7 @@
             </w:tcMar>
           </w:tcPr>
           <w:p>
-            <w:pPr>
-              <w:spacing w:after="0" w:line="240" w:lineRule="auto" w:before="0"/>
-              <w:jc w:val="left"/>
-            </w:pPr>
-            <w:r>
-              <w:rPr>
-                <w:rFonts w:ascii="Arial" w:hAnsi="Arial" w:eastAsia="Microsoft YaHei"/>
-                <w:b w:val="0"/>
-                <w:color w:val="232323"/>
-                <w:sz w:val="17"/>
-              </w:rPr>
+            <w:r>
               <w:t>协议项只显示计量仪、瓦锡兰、LTD、SI7000；保存后按协议自动收敛串口参数。</w:t>
             </w:r>
           </w:p>
@@ -5273,17 +4519,7 @@
             </w:tcMar>
           </w:tcPr>
           <w:p>
-            <w:pPr>
-              <w:spacing w:after="0" w:line="240" w:lineRule="auto" w:before="0"/>
-              <w:jc w:val="left"/>
-            </w:pPr>
-            <w:r>
-              <w:rPr>
-                <w:rFonts w:ascii="Arial" w:hAnsi="Arial" w:eastAsia="Microsoft YaHei"/>
-                <w:b w:val="0"/>
-                <w:color w:val="232323"/>
-                <w:sz w:val="17"/>
-              </w:rPr>
+            <w:r>
               <w:t>显示设置</w:t>
             </w:r>
           </w:p>
@@ -5300,17 +4536,7 @@
             </w:tcMar>
           </w:tcPr>
           <w:p>
-            <w:pPr>
-              <w:spacing w:after="0" w:line="240" w:lineRule="auto" w:before="0"/>
-              <w:jc w:val="left"/>
-            </w:pPr>
-            <w:r>
-              <w:rPr>
-                <w:rFonts w:ascii="Arial" w:hAnsi="Arial" w:eastAsia="Microsoft YaHei"/>
-                <w:b w:val="0"/>
-                <w:color w:val="232323"/>
-                <w:sz w:val="17"/>
-              </w:rPr>
+            <w:r>
               <w:t>显示基础、数据源与手输值</w:t>
             </w:r>
           </w:p>
@@ -5327,18 +4553,8 @@
             </w:tcMar>
           </w:tcPr>
           <w:p>
-            <w:pPr>
-              <w:spacing w:after="0" w:line="240" w:lineRule="auto" w:before="0"/>
-              <w:jc w:val="left"/>
-            </w:pPr>
-            <w:r>
-              <w:rPr>
-                <w:rFonts w:ascii="Arial" w:hAnsi="Arial" w:eastAsia="Microsoft YaHei"/>
-                <w:b w:val="0"/>
-                <w:color w:val="232323"/>
-                <w:sz w:val="17"/>
-              </w:rPr>
-              <w:t>显示基础含版本、语言、小数位、密码、息屏；数据源与手输值按液位/水位/密度/温度分组。</w:t>
+            <w:r>
+              <w:t>显示基础含版本、屏幕亮度、语言、小数位、密码、息屏；数据源与手输值按液位/水位/密度/温度分组。</w:t>
             </w:r>
           </w:p>
         </w:tc>
@@ -5375,17 +4591,7 @@
             </w:tcMar>
           </w:tcPr>
           <w:p>
-            <w:pPr>
-              <w:spacing w:after="0" w:line="240" w:lineRule="auto" w:before="0"/>
-              <w:jc w:val="left"/>
-            </w:pPr>
-            <w:r>
-              <w:rPr>
-                <w:rFonts w:ascii="Arial" w:hAnsi="Arial" w:eastAsia="Microsoft YaHei"/>
-                <w:b w:val="0"/>
-                <w:color w:val="232323"/>
-                <w:sz w:val="17"/>
-              </w:rPr>
+            <w:r>
               <w:t>维护设置</w:t>
             </w:r>
           </w:p>
@@ -5402,17 +4608,7 @@
             </w:tcMar>
           </w:tcPr>
           <w:p>
-            <w:pPr>
-              <w:spacing w:after="0" w:line="240" w:lineRule="auto" w:before="0"/>
-              <w:jc w:val="left"/>
-            </w:pPr>
-            <w:r>
-              <w:rPr>
-                <w:rFonts w:ascii="Arial" w:hAnsi="Arial" w:eastAsia="Microsoft YaHei"/>
-                <w:b w:val="0"/>
-                <w:color w:val="232323"/>
-                <w:sz w:val="17"/>
-              </w:rPr>
+            <w:r>
               <w:t>设备信息、参数校验</w:t>
             </w:r>
           </w:p>
@@ -5429,16 +4625,7 @@
             </w:tcMar>
           </w:tcPr>
           <w:p>
-            <w:pPr>
-              <w:spacing w:after="0" w:line="240" w:lineRule="auto" w:before="0"/>
-              <w:jc w:val="left"/>
-            </w:pPr>
-            <w:r>
-              <w:rPr>
-                <w:rFonts w:ascii="Arial" w:hAnsi="Arial" w:eastAsia="Microsoft YaHei"/>
-                <w:color w:val="232323"/>
-                <w:sz w:val="17"/>
-              </w:rPr>
+            <w:r>
               <w:t>设备版本、协议版本和参数校验信息以只读核对为主；版本字段按 Vx.x.x.x，魔术字和 CRC 按 0xXXXXXXXX 显示。</w:t>
             </w:r>
           </w:p>
@@ -35425,7 +34612,7 @@
           <w:color w:val="5A5A5A"/>
           <w:sz w:val="17"/>
         </w:rPr>
-        <w:t>菜单路径：参数配置 -&gt; 显示设置 -&gt; 显示基础。当前程序把 CPU3程序版本、语言、小数点位数、屏幕密码、息屏开关放在同一页。</w:t>
+        <w:t>菜单路径：参数配置 -&gt; 显示设置 -&gt; 显示基础。当前程序把 CPU3程序版本、屏幕亮度、语言、小数点位数、屏幕密码、息屏开关放在同一页。</w:t>
       </w:r>
     </w:p>
     <w:tbl>
@@ -35491,17 +34678,7 @@
             </w:tcMar>
           </w:tcPr>
           <w:p>
-            <w:pPr>
-              <w:spacing w:after="0" w:line="240" w:lineRule="auto" w:before="0"/>
-              <w:jc w:val="center"/>
-            </w:pPr>
-            <w:r>
-              <w:rPr>
-                <w:rFonts w:ascii="Arial" w:hAnsi="Arial" w:eastAsia="Microsoft YaHei"/>
-                <w:b/>
-                <w:color w:val="232323"/>
-                <w:sz w:val="16"/>
-              </w:rPr>
+            <w:r>
               <w:t>参数名称</w:t>
             </w:r>
           </w:p>
@@ -35519,17 +34696,7 @@
             </w:tcMar>
           </w:tcPr>
           <w:p>
-            <w:pPr>
-              <w:spacing w:after="0" w:line="240" w:lineRule="auto" w:before="0"/>
-              <w:jc w:val="center"/>
-            </w:pPr>
-            <w:r>
-              <w:rPr>
-                <w:rFonts w:ascii="Arial" w:hAnsi="Arial" w:eastAsia="Microsoft YaHei"/>
-                <w:b/>
-                <w:color w:val="232323"/>
-                <w:sz w:val="16"/>
-              </w:rPr>
+            <w:r>
               <w:t>参数含义</w:t>
             </w:r>
           </w:p>
@@ -35547,17 +34714,7 @@
             </w:tcMar>
           </w:tcPr>
           <w:p>
-            <w:pPr>
-              <w:spacing w:after="0" w:line="240" w:lineRule="auto" w:before="0"/>
-              <w:jc w:val="center"/>
-            </w:pPr>
-            <w:r>
-              <w:rPr>
-                <w:rFonts w:ascii="Arial" w:hAnsi="Arial" w:eastAsia="Microsoft YaHei"/>
-                <w:b/>
-                <w:color w:val="232323"/>
-                <w:sz w:val="16"/>
-              </w:rPr>
+            <w:r>
               <w:t>权限 / 范围/选项</w:t>
             </w:r>
           </w:p>
@@ -35575,17 +34732,7 @@
             </w:tcMar>
           </w:tcPr>
           <w:p>
-            <w:pPr>
-              <w:spacing w:after="0" w:line="240" w:lineRule="auto" w:before="0"/>
-              <w:jc w:val="center"/>
-            </w:pPr>
-            <w:r>
-              <w:rPr>
-                <w:rFonts w:ascii="Arial" w:hAnsi="Arial" w:eastAsia="Microsoft YaHei"/>
-                <w:b/>
-                <w:color w:val="232323"/>
-                <w:sz w:val="16"/>
-              </w:rPr>
+            <w:r>
               <w:t>单位/小数</w:t>
             </w:r>
           </w:p>
@@ -35603,17 +34750,7 @@
             </w:tcMar>
           </w:tcPr>
           <w:p>
-            <w:pPr>
-              <w:spacing w:after="0" w:line="240" w:lineRule="auto" w:before="0"/>
-              <w:jc w:val="center"/>
-            </w:pPr>
-            <w:r>
-              <w:rPr>
-                <w:rFonts w:ascii="Arial" w:hAnsi="Arial" w:eastAsia="Microsoft YaHei"/>
-                <w:b/>
-                <w:color w:val="232323"/>
-                <w:sz w:val="16"/>
-              </w:rPr>
+            <w:r>
               <w:t>出厂默认值</w:t>
             </w:r>
           </w:p>
@@ -35631,17 +34768,7 @@
             </w:tcMar>
           </w:tcPr>
           <w:p>
-            <w:pPr>
-              <w:spacing w:after="0" w:line="240" w:lineRule="auto" w:before="0"/>
-              <w:jc w:val="center"/>
-            </w:pPr>
-            <w:r>
-              <w:rPr>
-                <w:rFonts w:ascii="Arial" w:hAnsi="Arial" w:eastAsia="Microsoft YaHei"/>
-                <w:b/>
-                <w:color w:val="232323"/>
-                <w:sz w:val="16"/>
-              </w:rPr>
+            <w:r>
               <w:t>现场设置值 / 备注</w:t>
             </w:r>
           </w:p>
@@ -35679,17 +34806,7 @@
             </w:tcMar>
           </w:tcPr>
           <w:p>
-            <w:pPr>
-              <w:spacing w:after="0" w:line="240" w:lineRule="auto" w:before="0"/>
-              <w:jc w:val="left"/>
-            </w:pPr>
-            <w:r>
-              <w:rPr>
-                <w:rFonts w:ascii="Arial" w:hAnsi="Arial" w:eastAsia="Microsoft YaHei"/>
-                <w:b w:val="0"/>
-                <w:color w:val="232323"/>
-                <w:sz w:val="16"/>
-              </w:rPr>
+            <w:r>
               <w:t>CPU3程序版本（C3版本）</w:t>
             </w:r>
           </w:p>
@@ -35706,18 +34823,8 @@
             </w:tcMar>
           </w:tcPr>
           <w:p>
-            <w:pPr>
-              <w:spacing w:after="0" w:line="240" w:lineRule="auto" w:before="0"/>
-              <w:jc w:val="left"/>
-            </w:pPr>
-            <w:r>
-              <w:rPr>
-                <w:rFonts w:ascii="Arial" w:hAnsi="Arial" w:eastAsia="Microsoft YaHei"/>
-                <w:b w:val="0"/>
-                <w:color w:val="232323"/>
-                <w:sz w:val="16"/>
-              </w:rPr>
-              <w:t>用于现场查看或配置“CPU3程序版本”。</w:t>
+            <w:r>
+              <w:t>用于现场查看 CPU3 显示板程序版本。</w:t>
             </w:r>
           </w:p>
         </w:tc>
@@ -35733,17 +34840,7 @@
             </w:tcMar>
           </w:tcPr>
           <w:p>
-            <w:pPr>
-              <w:spacing w:after="0" w:line="240" w:lineRule="auto" w:before="0"/>
-              <w:jc w:val="left"/>
-            </w:pPr>
-            <w:r>
-              <w:rPr>
-                <w:rFonts w:ascii="Arial" w:hAnsi="Arial" w:eastAsia="Microsoft YaHei"/>
-                <w:b w:val="0"/>
-                <w:color w:val="232323"/>
-                <w:sz w:val="16"/>
-              </w:rPr>
+            <w:r>
               <w:t>只读</w:t>
             </w:r>
           </w:p>
@@ -35760,15 +34857,7 @@
             </w:tcMar>
           </w:tcPr>
           <w:p>
-            <w:pPr>
-              <w:spacing w:after="0" w:line="240" w:lineRule="auto" w:before="0"/>
-            </w:pPr>
-            <w:r>
-              <w:rPr>
-                <w:rFonts w:ascii="Arial" w:hAnsi="Arial" w:eastAsia="Microsoft YaHei"/>
-                <w:color w:val="232323"/>
-                <w:sz w:val="16"/>
-              </w:rPr>
+            <w:r>
               <w:t>- / Vx.x.x.x</w:t>
             </w:r>
           </w:p>
@@ -35785,15 +34874,8 @@
             </w:tcMar>
           </w:tcPr>
           <w:p>
-            <w:pPr>
-              <w:spacing w:before="0" w:after="0" w:line="240" w:lineRule="auto"/>
-            </w:pPr>
-            <w:r>
-              <w:rPr>
-                <w:rFonts w:ascii="Arial" w:hAnsi="Arial" w:eastAsia="Microsoft YaHei"/>
-                <w:sz w:val="16"/>
-              </w:rPr>
-              <w:t>V1.11.1.4（当前 CPU3 固件版本）</w:t>
+            <w:r>
+              <w:t>V1.14.0.0（当前 CPU3 固件版本）</w:t>
             </w:r>
           </w:p>
         </w:tc>
@@ -35809,10 +34891,7 @@
             </w:tcMar>
           </w:tcPr>
           <w:p>
-            <w:pPr>
-              <w:spacing w:after="0" w:line="240" w:lineRule="auto" w:before="0"/>
-              <w:jc w:val="left"/>
-            </w:pPr>
+            <w:r/>
           </w:p>
         </w:tc>
       </w:tr>
@@ -35848,18 +34927,8 @@
             </w:tcMar>
           </w:tcPr>
           <w:p>
-            <w:pPr>
-              <w:spacing w:after="0" w:line="240" w:lineRule="auto" w:before="0"/>
-              <w:jc w:val="left"/>
-            </w:pPr>
-            <w:r>
-              <w:rPr>
-                <w:rFonts w:ascii="Arial" w:hAnsi="Arial" w:eastAsia="Microsoft YaHei"/>
-                <w:b w:val="0"/>
-                <w:color w:val="232323"/>
-                <w:sz w:val="16"/>
-              </w:rPr>
-              <w:t>语言</w:t>
+            <w:r>
+              <w:t>屏幕亮度</w:t>
             </w:r>
           </w:p>
         </w:tc>
@@ -35875,18 +34944,8 @@
             </w:tcMar>
           </w:tcPr>
           <w:p>
-            <w:pPr>
-              <w:spacing w:after="0" w:line="240" w:lineRule="auto" w:before="0"/>
-              <w:jc w:val="left"/>
-            </w:pPr>
-            <w:r>
-              <w:rPr>
-                <w:rFonts w:ascii="Arial" w:hAnsi="Arial" w:eastAsia="Microsoft YaHei"/>
-                <w:b w:val="0"/>
-                <w:color w:val="232323"/>
-                <w:sz w:val="16"/>
-              </w:rPr>
-              <w:t>选择屏幕显示语言。</w:t>
+            <w:r>
+              <w:t>设置 OLED 屏幕亮度挡位。</w:t>
             </w:r>
           </w:p>
         </w:tc>
@@ -35902,18 +34961,8 @@
             </w:tcMar>
           </w:tcPr>
           <w:p>
-            <w:pPr>
-              <w:spacing w:after="0" w:line="240" w:lineRule="auto" w:before="0"/>
-              <w:jc w:val="left"/>
-            </w:pPr>
-            <w:r>
-              <w:rPr>
-                <w:rFonts w:ascii="Arial" w:hAnsi="Arial" w:eastAsia="Microsoft YaHei"/>
-                <w:b w:val="0"/>
-                <w:color w:val="232323"/>
-                <w:sz w:val="16"/>
-              </w:rPr>
-              <w:t>可写；0=中文；1=英文</w:t>
+            <w:r>
+              <w:t>可写；0=低；1=中低；2=中；3=中高；4=高</w:t>
             </w:r>
           </w:p>
         </w:tc>
@@ -35929,17 +34978,7 @@
             </w:tcMar>
           </w:tcPr>
           <w:p>
-            <w:pPr>
-              <w:spacing w:after="0" w:line="240" w:lineRule="auto" w:before="0"/>
-              <w:jc w:val="left"/>
-            </w:pPr>
-            <w:r>
-              <w:rPr>
-                <w:rFonts w:ascii="Arial" w:hAnsi="Arial" w:eastAsia="Microsoft YaHei"/>
-                <w:b w:val="0"/>
-                <w:color w:val="232323"/>
-                <w:sz w:val="16"/>
-              </w:rPr>
+            <w:r>
               <w:t>- / 整数</w:t>
             </w:r>
           </w:p>
@@ -35956,18 +34995,8 @@
             </w:tcMar>
           </w:tcPr>
           <w:p>
-            <w:pPr>
-              <w:spacing w:after="0" w:line="240" w:lineRule="auto" w:before="0"/>
-              <w:jc w:val="left"/>
-            </w:pPr>
-            <w:r>
-              <w:rPr>
-                <w:rFonts w:ascii="Arial" w:hAnsi="Arial" w:eastAsia="Microsoft YaHei"/>
-                <w:b w:val="0"/>
-                <w:color w:val="232323"/>
-                <w:sz w:val="16"/>
-              </w:rPr>
-              <w:t>0（中文）</w:t>
+            <w:r>
+              <w:t>1（中低）</w:t>
             </w:r>
           </w:p>
         </w:tc>
@@ -35983,10 +35012,9 @@
             </w:tcMar>
           </w:tcPr>
           <w:p>
-            <w:pPr>
-              <w:spacing w:after="0" w:line="240" w:lineRule="auto" w:before="0"/>
-              <w:jc w:val="left"/>
-            </w:pPr>
+            <w:r>
+              <w:t>保存后立即应用到 OLED 对比度。</w:t>
+            </w:r>
           </w:p>
         </w:tc>
       </w:tr>
@@ -36022,18 +35050,8 @@
             </w:tcMar>
           </w:tcPr>
           <w:p>
-            <w:pPr>
-              <w:spacing w:after="0" w:line="240" w:lineRule="auto" w:before="0"/>
-              <w:jc w:val="left"/>
-            </w:pPr>
-            <w:r>
-              <w:rPr>
-                <w:rFonts w:ascii="Arial" w:hAnsi="Arial" w:eastAsia="Microsoft YaHei"/>
-                <w:b w:val="0"/>
-                <w:color w:val="232323"/>
-                <w:sz w:val="16"/>
-              </w:rPr>
-              <w:t>小数点位数（小数点位）</w:t>
+            <w:r>
+              <w:t>语言</w:t>
             </w:r>
           </w:p>
         </w:tc>
@@ -36049,18 +35067,8 @@
             </w:tcMar>
           </w:tcPr>
           <w:p>
-            <w:pPr>
-              <w:spacing w:after="0" w:line="240" w:lineRule="auto" w:before="0"/>
-              <w:jc w:val="left"/>
-            </w:pPr>
-            <w:r>
-              <w:rPr>
-                <w:rFonts w:ascii="Arial" w:hAnsi="Arial" w:eastAsia="Microsoft YaHei"/>
-                <w:b w:val="0"/>
-                <w:color w:val="232323"/>
-                <w:sz w:val="16"/>
-              </w:rPr>
-              <w:t>设置屏幕显示数值的小数位数。</w:t>
+            <w:r>
+              <w:t>选择屏幕显示语言。</w:t>
             </w:r>
           </w:p>
         </w:tc>
@@ -36076,18 +35084,8 @@
             </w:tcMar>
           </w:tcPr>
           <w:p>
-            <w:pPr>
-              <w:spacing w:after="0" w:line="240" w:lineRule="auto" w:before="0"/>
-              <w:jc w:val="left"/>
-            </w:pPr>
-            <w:r>
-              <w:rPr>
-                <w:rFonts w:ascii="Arial" w:hAnsi="Arial" w:eastAsia="Microsoft YaHei"/>
-                <w:b w:val="0"/>
-                <w:color w:val="232323"/>
-                <w:sz w:val="16"/>
-              </w:rPr>
-              <w:t>可写；0/1/2/3/4 位</w:t>
+            <w:r>
+              <w:t>可写；0=中文；1=英文</w:t>
             </w:r>
           </w:p>
         </w:tc>
@@ -36103,18 +35101,8 @@
             </w:tcMar>
           </w:tcPr>
           <w:p>
-            <w:pPr>
-              <w:spacing w:after="0" w:line="240" w:lineRule="auto" w:before="0"/>
-              <w:jc w:val="left"/>
-            </w:pPr>
-            <w:r>
-              <w:rPr>
-                <w:rFonts w:ascii="Arial" w:hAnsi="Arial" w:eastAsia="Microsoft YaHei"/>
-                <w:b w:val="0"/>
-                <w:color w:val="232323"/>
-                <w:sz w:val="16"/>
-              </w:rPr>
-              <w:t>位 / 整数</w:t>
+            <w:r>
+              <w:t>- / 整数</w:t>
             </w:r>
           </w:p>
         </w:tc>
@@ -36130,18 +35118,8 @@
             </w:tcMar>
           </w:tcPr>
           <w:p>
-            <w:pPr>
-              <w:spacing w:after="0" w:line="240" w:lineRule="auto" w:before="0"/>
-              <w:jc w:val="left"/>
-            </w:pPr>
-            <w:r>
-              <w:rPr>
-                <w:rFonts w:ascii="Arial" w:hAnsi="Arial" w:eastAsia="Microsoft YaHei"/>
-                <w:b w:val="0"/>
-                <w:color w:val="232323"/>
-                <w:sz w:val="16"/>
-              </w:rPr>
-              <w:t>2</w:t>
+            <w:r>
+              <w:t>0（中文）</w:t>
             </w:r>
           </w:p>
         </w:tc>
@@ -36157,10 +35135,7 @@
             </w:tcMar>
           </w:tcPr>
           <w:p>
-            <w:pPr>
-              <w:spacing w:after="0" w:line="240" w:lineRule="auto" w:before="0"/>
-              <w:jc w:val="left"/>
-            </w:pPr>
+            <w:r/>
           </w:p>
         </w:tc>
       </w:tr>
@@ -36196,18 +35171,8 @@
             </w:tcMar>
           </w:tcPr>
           <w:p>
-            <w:pPr>
-              <w:spacing w:after="0" w:line="240" w:lineRule="auto" w:before="0"/>
-              <w:jc w:val="left"/>
-            </w:pPr>
-            <w:r>
-              <w:rPr>
-                <w:rFonts w:ascii="Arial" w:hAnsi="Arial" w:eastAsia="Microsoft YaHei"/>
-                <w:b w:val="0"/>
-                <w:color w:val="232323"/>
-                <w:sz w:val="16"/>
-              </w:rPr>
-              <w:t>屏幕密码</w:t>
+            <w:r>
+              <w:t>小数点位数（小数点位）</w:t>
             </w:r>
           </w:p>
         </w:tc>
@@ -36223,18 +35188,8 @@
             </w:tcMar>
           </w:tcPr>
           <w:p>
-            <w:pPr>
-              <w:spacing w:after="0" w:line="240" w:lineRule="auto" w:before="0"/>
-              <w:jc w:val="left"/>
-            </w:pPr>
-            <w:r>
-              <w:rPr>
-                <w:rFonts w:ascii="Arial" w:hAnsi="Arial" w:eastAsia="Microsoft YaHei"/>
-                <w:b w:val="0"/>
-                <w:color w:val="232323"/>
-                <w:sz w:val="16"/>
-              </w:rPr>
-              <w:t>设置进入屏幕菜单时使用的密码。</w:t>
+            <w:r>
+              <w:t>设置屏幕显示数值的小数位数。</w:t>
             </w:r>
           </w:p>
         </w:tc>
@@ -36250,18 +35205,8 @@
             </w:tcMar>
           </w:tcPr>
           <w:p>
-            <w:pPr>
-              <w:spacing w:after="0" w:line="240" w:lineRule="auto" w:before="0"/>
-              <w:jc w:val="left"/>
-            </w:pPr>
-            <w:r>
-              <w:rPr>
-                <w:rFonts w:ascii="Arial" w:hAnsi="Arial" w:eastAsia="Microsoft YaHei"/>
-                <w:b w:val="0"/>
-                <w:color w:val="232323"/>
-                <w:sz w:val="16"/>
-              </w:rPr>
-              <w:t>可写；0 ~ 9999</w:t>
+            <w:r>
+              <w:t>可写；0/1/2/3/4 位</w:t>
             </w:r>
           </w:p>
         </w:tc>
@@ -36277,18 +35222,8 @@
             </w:tcMar>
           </w:tcPr>
           <w:p>
-            <w:pPr>
-              <w:spacing w:after="0" w:line="240" w:lineRule="auto" w:before="0"/>
-              <w:jc w:val="left"/>
-            </w:pPr>
-            <w:r>
-              <w:rPr>
-                <w:rFonts w:ascii="Arial" w:hAnsi="Arial" w:eastAsia="Microsoft YaHei"/>
-                <w:b w:val="0"/>
-                <w:color w:val="232323"/>
-                <w:sz w:val="16"/>
-              </w:rPr>
-              <w:t>- / 整数</w:t>
+            <w:r>
+              <w:t>位 / 整数</w:t>
             </w:r>
           </w:p>
         </w:tc>
@@ -36304,10 +35239,9 @@
             </w:tcMar>
           </w:tcPr>
           <w:p>
-            <w:pPr>
-              <w:spacing w:after="0" w:line="240" w:lineRule="auto" w:before="0"/>
-              <w:jc w:val="left"/>
-            </w:pPr>
+            <w:r>
+              <w:t>2</w:t>
+            </w:r>
           </w:p>
         </w:tc>
         <w:tc>
@@ -36322,19 +35256,7 @@
             </w:tcMar>
           </w:tcPr>
           <w:p>
-            <w:pPr>
-              <w:spacing w:after="0" w:line="240" w:lineRule="auto" w:before="0"/>
-              <w:jc w:val="left"/>
-            </w:pPr>
-            <w:r>
-              <w:rPr>
-                <w:rFonts w:ascii="Arial" w:hAnsi="Arial" w:eastAsia="Microsoft YaHei"/>
-                <w:b w:val="0"/>
-                <w:color w:val="232323"/>
-                <w:sz w:val="16"/>
-              </w:rPr>
-              <w:t>按现场配置填写。</w:t>
-            </w:r>
+            <w:r/>
           </w:p>
         </w:tc>
       </w:tr>
@@ -36370,149 +35292,152 @@
             </w:tcMar>
           </w:tcPr>
           <w:p>
-            <w:pPr>
-              <w:spacing w:after="0" w:line="240" w:lineRule="auto" w:before="0"/>
-              <w:jc w:val="left"/>
-            </w:pPr>
-            <w:r>
-              <w:rPr>
-                <w:rFonts w:ascii="Arial" w:hAnsi="Arial" w:eastAsia="Microsoft YaHei"/>
-                <w:b w:val="0"/>
-                <w:color w:val="232323"/>
-                <w:sz w:val="16"/>
-              </w:rPr>
+            <w:r>
+              <w:t>屏幕密码</w:t>
+            </w:r>
+          </w:p>
+        </w:tc>
+        <w:tc>
+          <w:tcPr>
+            <w:tcW w:w="3600" w:type="dxa"/>
+            <w:vAlign w:val="center"/>
+            <w:tcMar>
+              <w:top w:w="45" w:type="dxa"/>
+              <w:start w:w="55" w:type="dxa"/>
+              <w:bottom w:w="45" w:type="dxa"/>
+              <w:end w:w="55" w:type="dxa"/>
+            </w:tcMar>
+          </w:tcPr>
+          <w:p>
+            <w:r>
+              <w:t>设置进入屏幕菜单时使用的密码。</w:t>
+            </w:r>
+          </w:p>
+        </w:tc>
+        <w:tc>
+          <w:tcPr>
+            <w:tcW w:w="2232" w:type="dxa"/>
+            <w:vAlign w:val="center"/>
+            <w:tcMar>
+              <w:top w:w="45" w:type="dxa"/>
+              <w:start w:w="55" w:type="dxa"/>
+              <w:bottom w:w="45" w:type="dxa"/>
+              <w:end w:w="55" w:type="dxa"/>
+            </w:tcMar>
+          </w:tcPr>
+          <w:p>
+            <w:r>
+              <w:t>可写；0 ~ 9999</w:t>
+            </w:r>
+          </w:p>
+        </w:tc>
+        <w:tc>
+          <w:tcPr>
+            <w:tcW w:w="1656" w:type="dxa"/>
+            <w:vAlign w:val="center"/>
+            <w:tcMar>
+              <w:top w:w="45" w:type="dxa"/>
+              <w:start w:w="55" w:type="dxa"/>
+              <w:bottom w:w="45" w:type="dxa"/>
+              <w:end w:w="55" w:type="dxa"/>
+            </w:tcMar>
+          </w:tcPr>
+          <w:p>
+            <w:r>
+              <w:t>- / 整数</w:t>
+            </w:r>
+          </w:p>
+        </w:tc>
+        <w:tc>
+          <w:tcPr>
+            <w:tcW w:w="1944" w:type="dxa"/>
+            <w:vAlign w:val="center"/>
+            <w:tcMar>
+              <w:top w:w="45" w:type="dxa"/>
+              <w:start w:w="55" w:type="dxa"/>
+              <w:bottom w:w="45" w:type="dxa"/>
+              <w:end w:w="55" w:type="dxa"/>
+            </w:tcMar>
+          </w:tcPr>
+          <w:p>
+            <w:r/>
+          </w:p>
+        </w:tc>
+        <w:tc>
+          <w:tcPr>
+            <w:tcW w:w="3240" w:type="dxa"/>
+            <w:vAlign w:val="center"/>
+            <w:tcMar>
+              <w:top w:w="45" w:type="dxa"/>
+              <w:start w:w="55" w:type="dxa"/>
+              <w:bottom w:w="45" w:type="dxa"/>
+              <w:end w:w="55" w:type="dxa"/>
+            </w:tcMar>
+          </w:tcPr>
+          <w:p>
+            <w:r>
+              <w:t>按现场配置填写。</w:t>
+            </w:r>
+          </w:p>
+        </w:tc>
+      </w:tr>
+      <w:tr>
+        <w:tc>
+          <w:tcPr>
+            <w:tcW w:type="dxa" w:w="2432"/>
+          </w:tcPr>
+          <w:p>
+            <w:r>
               <w:t>息屏开关</w:t>
             </w:r>
           </w:p>
         </w:tc>
         <w:tc>
           <w:tcPr>
-            <w:tcW w:w="3600" w:type="dxa"/>
-            <w:vAlign w:val="center"/>
-            <w:tcMar>
-              <w:top w:w="45" w:type="dxa"/>
-              <w:start w:w="55" w:type="dxa"/>
-              <w:bottom w:w="45" w:type="dxa"/>
-              <w:end w:w="55" w:type="dxa"/>
-            </w:tcMar>
-          </w:tcPr>
-          <w:p>
-            <w:pPr>
-              <w:spacing w:after="0" w:line="240" w:lineRule="auto" w:before="0"/>
-              <w:jc w:val="left"/>
-            </w:pPr>
-            <w:r>
-              <w:rPr>
-                <w:rFonts w:ascii="Arial" w:hAnsi="Arial" w:eastAsia="Microsoft YaHei"/>
-                <w:b w:val="0"/>
-                <w:color w:val="232323"/>
-                <w:sz w:val="16"/>
-              </w:rPr>
+            <w:tcW w:type="dxa" w:w="2432"/>
+          </w:tcPr>
+          <w:p>
+            <w:r>
               <w:t>控制屏幕是否启用息屏功能。</w:t>
             </w:r>
           </w:p>
         </w:tc>
         <w:tc>
           <w:tcPr>
-            <w:tcW w:w="2232" w:type="dxa"/>
-            <w:vAlign w:val="center"/>
-            <w:tcMar>
-              <w:top w:w="45" w:type="dxa"/>
-              <w:start w:w="55" w:type="dxa"/>
-              <w:bottom w:w="45" w:type="dxa"/>
-              <w:end w:w="55" w:type="dxa"/>
-            </w:tcMar>
-          </w:tcPr>
-          <w:p>
-            <w:pPr>
-              <w:spacing w:after="0" w:line="240" w:lineRule="auto" w:before="0"/>
-              <w:jc w:val="left"/>
-            </w:pPr>
-            <w:r>
-              <w:rPr>
-                <w:rFonts w:ascii="Arial" w:hAnsi="Arial" w:eastAsia="Microsoft YaHei"/>
-                <w:b w:val="0"/>
-                <w:color w:val="232323"/>
-                <w:sz w:val="16"/>
-              </w:rPr>
+            <w:tcW w:type="dxa" w:w="2432"/>
+          </w:tcPr>
+          <w:p>
+            <w:r>
               <w:t>可写；0=否；1=是</w:t>
             </w:r>
           </w:p>
         </w:tc>
         <w:tc>
           <w:tcPr>
-            <w:tcW w:w="1656" w:type="dxa"/>
-            <w:vAlign w:val="center"/>
-            <w:tcMar>
-              <w:top w:w="45" w:type="dxa"/>
-              <w:start w:w="55" w:type="dxa"/>
-              <w:bottom w:w="45" w:type="dxa"/>
-              <w:end w:w="55" w:type="dxa"/>
-            </w:tcMar>
-          </w:tcPr>
-          <w:p>
-            <w:pPr>
-              <w:spacing w:after="0" w:line="240" w:lineRule="auto" w:before="0"/>
-              <w:jc w:val="left"/>
-            </w:pPr>
-            <w:r>
-              <w:rPr>
-                <w:rFonts w:ascii="Arial" w:hAnsi="Arial" w:eastAsia="Microsoft YaHei"/>
-                <w:b w:val="0"/>
-                <w:color w:val="232323"/>
-                <w:sz w:val="16"/>
-              </w:rPr>
+            <w:tcW w:type="dxa" w:w="2432"/>
+          </w:tcPr>
+          <w:p>
+            <w:r>
               <w:t>- / 整数</w:t>
             </w:r>
           </w:p>
         </w:tc>
         <w:tc>
           <w:tcPr>
-            <w:tcW w:w="1944" w:type="dxa"/>
-            <w:vAlign w:val="center"/>
-            <w:tcMar>
-              <w:top w:w="45" w:type="dxa"/>
-              <w:start w:w="55" w:type="dxa"/>
-              <w:bottom w:w="45" w:type="dxa"/>
-              <w:end w:w="55" w:type="dxa"/>
-            </w:tcMar>
-          </w:tcPr>
-          <w:p>
-            <w:pPr>
-              <w:spacing w:after="0" w:line="240" w:lineRule="auto" w:before="0"/>
-              <w:jc w:val="left"/>
-              <w:rPr>
-                <w:rFonts w:hint="default" w:eastAsia="宋体"/>
-                <w:lang w:val="en-US" w:eastAsia="zh-CN"/>
-              </w:rPr>
-            </w:pPr>
-            <w:r>
-              <w:rPr>
-                <w:rFonts w:ascii="Arial" w:hAnsi="Arial" w:eastAsia="Microsoft YaHei"/>
-                <w:b w:val="0"/>
-                <w:color w:val="232323"/>
-                <w:sz w:val="16"/>
-              </w:rPr>
+            <w:tcW w:type="dxa" w:w="2432"/>
+          </w:tcPr>
+          <w:p>
+            <w:r>
               <w:t>0（否）</w:t>
             </w:r>
           </w:p>
         </w:tc>
         <w:tc>
           <w:tcPr>
-            <w:tcW w:w="3240" w:type="dxa"/>
-            <w:vAlign w:val="center"/>
-            <w:tcMar>
-              <w:top w:w="45" w:type="dxa"/>
-              <w:start w:w="55" w:type="dxa"/>
-              <w:bottom w:w="45" w:type="dxa"/>
-              <w:end w:w="55" w:type="dxa"/>
-            </w:tcMar>
-          </w:tcPr>
-          <w:p>
-            <w:pPr>
-              <w:spacing w:after="0" w:line="240" w:lineRule="auto" w:before="0"/>
-              <w:jc w:val="left"/>
-            </w:pPr>
+            <w:tcW w:type="dxa" w:w="2432"/>
+          </w:tcPr>
+          <w:p>
+            <w:r/>
           </w:p>
         </w:tc>
       </w:tr>

</xml_diff>